<commit_message>
TP3: Actividad 1 basada en el capítulo 16 (Scaling Strategies)
Co-Authored-By: Claude Opus 5.5 <noreply@anthropic.com>
</commit_message>
<xml_diff>
--- a/docs/TP3-Escalabilidad-Abrigate.docx
+++ b/docs/TP3-Escalabilidad-Abrigate.docx
@@ -155,7 +155,7 @@
     <w:sdt>
       <w:sdtPr>
         <w:alias w:val="Índice"/>
-        <w:id w:val="1425765347"/>
+        <w:id w:val="429866318"/>
         <w:docPartObj>
           <w:docPartGallery w:val="Table of Contents"/>
           <w:docPartUnique/>
@@ -187,7 +187,7 @@
           <w:r>
             <w:fldChar w:fldCharType="separate"/>
           </w:r>
-          <w:hyperlink w:anchor="_Toc244001155" w:history="1">
+          <w:hyperlink w:anchor="_Toc244019286" w:history="1">
             <w:r>
               <w:rPr>
                 <w:rStyle w:val="Hipervnculo"/>
@@ -211,7 +211,7 @@
               <w:rPr>
                 <w:noProof/>
               </w:rPr>
-              <w:instrText xml:space="preserve"> PAGEREF _Toc244001155 \h </w:instrText>
+              <w:instrText xml:space="preserve"> PAGEREF _Toc244019286 \h </w:instrText>
             </w:r>
             <w:r>
               <w:rPr>
@@ -253,7 +253,7 @@
               <w14:ligatures w14:val="standardContextual"/>
             </w:rPr>
           </w:pPr>
-          <w:hyperlink w:anchor="_Toc244001156" w:history="1">
+          <w:hyperlink w:anchor="_Toc244019287" w:history="1">
             <w:r>
               <w:rPr>
                 <w:rStyle w:val="Hipervnculo"/>
@@ -277,7 +277,7 @@
               <w:rPr>
                 <w:noProof/>
               </w:rPr>
-              <w:instrText xml:space="preserve"> PAGEREF _Toc244001156 \h </w:instrText>
+              <w:instrText xml:space="preserve"> PAGEREF _Toc244019287 \h </w:instrText>
             </w:r>
             <w:r>
               <w:rPr>
@@ -319,13 +319,13 @@
               <w14:ligatures w14:val="standardContextual"/>
             </w:rPr>
           </w:pPr>
-          <w:hyperlink w:anchor="_Toc244001157" w:history="1">
+          <w:hyperlink w:anchor="_Toc244019288" w:history="1">
             <w:r>
               <w:rPr>
                 <w:rStyle w:val="Hipervnculo"/>
                 <w:noProof/>
               </w:rPr>
-              <w:t>2.1 Desafíos comunes al escalar aplicaciones móviles</w:t>
+              <w:t>2.1 Ideas centrales del capítulo 16</w:t>
             </w:r>
             <w:r>
               <w:rPr>
@@ -343,7 +343,7 @@
               <w:rPr>
                 <w:noProof/>
               </w:rPr>
-              <w:instrText xml:space="preserve"> PAGEREF _Toc244001157 \h </w:instrText>
+              <w:instrText xml:space="preserve"> PAGEREF _Toc244019288 \h </w:instrText>
             </w:r>
             <w:r>
               <w:rPr>
@@ -385,13 +385,13 @@
               <w14:ligatures w14:val="standardContextual"/>
             </w:rPr>
           </w:pPr>
-          <w:hyperlink w:anchor="_Toc244001158" w:history="1">
+          <w:hyperlink w:anchor="_Toc244019289" w:history="1">
             <w:r>
               <w:rPr>
                 <w:rStyle w:val="Hipervnculo"/>
                 <w:noProof/>
               </w:rPr>
-              <w:t>2.2 Conclusión del análisis</w:t>
+              <w:t>2.2 Desafíos comunes al escalar aplicaciones móviles</w:t>
             </w:r>
             <w:r>
               <w:rPr>
@@ -409,7 +409,73 @@
               <w:rPr>
                 <w:noProof/>
               </w:rPr>
-              <w:instrText xml:space="preserve"> PAGEREF _Toc244001158 \h </w:instrText>
+              <w:instrText xml:space="preserve"> PAGEREF _Toc244019289 \h </w:instrText>
+            </w:r>
+            <w:r>
+              <w:rPr>
+                <w:noProof/>
+              </w:rPr>
+            </w:r>
+            <w:r>
+              <w:rPr>
+                <w:noProof/>
+              </w:rPr>
+              <w:fldChar w:fldCharType="separate"/>
+            </w:r>
+            <w:r>
+              <w:rPr>
+                <w:noProof/>
+              </w:rPr>
+              <w:t>4</w:t>
+            </w:r>
+            <w:r>
+              <w:rPr>
+                <w:noProof/>
+              </w:rPr>
+              <w:fldChar w:fldCharType="end"/>
+            </w:r>
+          </w:hyperlink>
+        </w:p>
+        <w:p>
+          <w:pPr>
+            <w:pStyle w:val="TDC2"/>
+            <w:tabs>
+              <w:tab w:val="right" w:leader="dot" w:pos="9062"/>
+            </w:tabs>
+            <w:rPr>
+              <w:rFonts w:asciiTheme="minorHAnsi" w:eastAsiaTheme="minorEastAsia" w:hAnsiTheme="minorHAnsi" w:cstheme="minorBidi"/>
+              <w:noProof/>
+              <w:kern w:val="2"/>
+              <w:sz w:val="24"/>
+              <w:szCs w:val="24"/>
+              <w14:ligatures w14:val="standardContextual"/>
+            </w:rPr>
+          </w:pPr>
+          <w:hyperlink w:anchor="_Toc244019290" w:history="1">
+            <w:r>
+              <w:rPr>
+                <w:rStyle w:val="Hipervnculo"/>
+                <w:noProof/>
+              </w:rPr>
+              <w:t>2.3 Conclusión del análisis</w:t>
+            </w:r>
+            <w:r>
+              <w:rPr>
+                <w:noProof/>
+              </w:rPr>
+              <w:tab/>
+            </w:r>
+            <w:r>
+              <w:rPr>
+                <w:noProof/>
+              </w:rPr>
+              <w:fldChar w:fldCharType="begin"/>
+            </w:r>
+            <w:r>
+              <w:rPr>
+                <w:noProof/>
+              </w:rPr>
+              <w:instrText xml:space="preserve"> PAGEREF _Toc244019290 \h </w:instrText>
             </w:r>
             <w:r>
               <w:rPr>
@@ -451,7 +517,7 @@
               <w14:ligatures w14:val="standardContextual"/>
             </w:rPr>
           </w:pPr>
-          <w:hyperlink w:anchor="_Toc244001159" w:history="1">
+          <w:hyperlink w:anchor="_Toc244019291" w:history="1">
             <w:r>
               <w:rPr>
                 <w:rStyle w:val="Hipervnculo"/>
@@ -475,7 +541,7 @@
               <w:rPr>
                 <w:noProof/>
               </w:rPr>
-              <w:instrText xml:space="preserve"> PAGEREF _Toc244001159 \h </w:instrText>
+              <w:instrText xml:space="preserve"> PAGEREF _Toc244019291 \h </w:instrText>
             </w:r>
             <w:r>
               <w:rPr>
@@ -492,7 +558,7 @@
               <w:rPr>
                 <w:noProof/>
               </w:rPr>
-              <w:t>4</w:t>
+              <w:t>5</w:t>
             </w:r>
             <w:r>
               <w:rPr>
@@ -517,7 +583,7 @@
               <w14:ligatures w14:val="standardContextual"/>
             </w:rPr>
           </w:pPr>
-          <w:hyperlink w:anchor="_Toc244001160" w:history="1">
+          <w:hyperlink w:anchor="_Toc244019292" w:history="1">
             <w:r>
               <w:rPr>
                 <w:rStyle w:val="Hipervnculo"/>
@@ -541,7 +607,7 @@
               <w:rPr>
                 <w:noProof/>
               </w:rPr>
-              <w:instrText xml:space="preserve"> PAGEREF _Toc244001160 \h </w:instrText>
+              <w:instrText xml:space="preserve"> PAGEREF _Toc244019292 \h </w:instrText>
             </w:r>
             <w:r>
               <w:rPr>
@@ -558,7 +624,7 @@
               <w:rPr>
                 <w:noProof/>
               </w:rPr>
-              <w:t>4</w:t>
+              <w:t>5</w:t>
             </w:r>
             <w:r>
               <w:rPr>
@@ -583,7 +649,7 @@
               <w14:ligatures w14:val="standardContextual"/>
             </w:rPr>
           </w:pPr>
-          <w:hyperlink w:anchor="_Toc244001161" w:history="1">
+          <w:hyperlink w:anchor="_Toc244019293" w:history="1">
             <w:r>
               <w:rPr>
                 <w:rStyle w:val="Hipervnculo"/>
@@ -607,7 +673,7 @@
               <w:rPr>
                 <w:noProof/>
               </w:rPr>
-              <w:instrText xml:space="preserve"> PAGEREF _Toc244001161 \h </w:instrText>
+              <w:instrText xml:space="preserve"> PAGEREF _Toc244019293 \h </w:instrText>
             </w:r>
             <w:r>
               <w:rPr>
@@ -624,7 +690,7 @@
               <w:rPr>
                 <w:noProof/>
               </w:rPr>
-              <w:t>4</w:t>
+              <w:t>5</w:t>
             </w:r>
             <w:r>
               <w:rPr>
@@ -649,7 +715,7 @@
               <w14:ligatures w14:val="standardContextual"/>
             </w:rPr>
           </w:pPr>
-          <w:hyperlink w:anchor="_Toc244001162" w:history="1">
+          <w:hyperlink w:anchor="_Toc244019294" w:history="1">
             <w:r>
               <w:rPr>
                 <w:rStyle w:val="Hipervnculo"/>
@@ -673,7 +739,7 @@
               <w:rPr>
                 <w:noProof/>
               </w:rPr>
-              <w:instrText xml:space="preserve"> PAGEREF _Toc244001162 \h </w:instrText>
+              <w:instrText xml:space="preserve"> PAGEREF _Toc244019294 \h </w:instrText>
             </w:r>
             <w:r>
               <w:rPr>
@@ -690,7 +756,7 @@
               <w:rPr>
                 <w:noProof/>
               </w:rPr>
-              <w:t>4</w:t>
+              <w:t>5</w:t>
             </w:r>
             <w:r>
               <w:rPr>
@@ -715,7 +781,7 @@
               <w14:ligatures w14:val="standardContextual"/>
             </w:rPr>
           </w:pPr>
-          <w:hyperlink w:anchor="_Toc244001163" w:history="1">
+          <w:hyperlink w:anchor="_Toc244019295" w:history="1">
             <w:r>
               <w:rPr>
                 <w:rStyle w:val="Hipervnculo"/>
@@ -739,7 +805,7 @@
               <w:rPr>
                 <w:noProof/>
               </w:rPr>
-              <w:instrText xml:space="preserve"> PAGEREF _Toc244001163 \h </w:instrText>
+              <w:instrText xml:space="preserve"> PAGEREF _Toc244019295 \h </w:instrText>
             </w:r>
             <w:r>
               <w:rPr>
@@ -756,7 +822,7 @@
               <w:rPr>
                 <w:noProof/>
               </w:rPr>
-              <w:t>5</w:t>
+              <w:t>6</w:t>
             </w:r>
             <w:r>
               <w:rPr>
@@ -781,7 +847,7 @@
               <w14:ligatures w14:val="standardContextual"/>
             </w:rPr>
           </w:pPr>
-          <w:hyperlink w:anchor="_Toc244001164" w:history="1">
+          <w:hyperlink w:anchor="_Toc244019296" w:history="1">
             <w:r>
               <w:rPr>
                 <w:rStyle w:val="Hipervnculo"/>
@@ -805,7 +871,7 @@
               <w:rPr>
                 <w:noProof/>
               </w:rPr>
-              <w:instrText xml:space="preserve"> PAGEREF _Toc244001164 \h </w:instrText>
+              <w:instrText xml:space="preserve"> PAGEREF _Toc244019296 \h </w:instrText>
             </w:r>
             <w:r>
               <w:rPr>
@@ -822,7 +888,7 @@
               <w:rPr>
                 <w:noProof/>
               </w:rPr>
-              <w:t>5</w:t>
+              <w:t>6</w:t>
             </w:r>
             <w:r>
               <w:rPr>
@@ -847,7 +913,7 @@
               <w14:ligatures w14:val="standardContextual"/>
             </w:rPr>
           </w:pPr>
-          <w:hyperlink w:anchor="_Toc244001165" w:history="1">
+          <w:hyperlink w:anchor="_Toc244019297" w:history="1">
             <w:r>
               <w:rPr>
                 <w:rStyle w:val="Hipervnculo"/>
@@ -871,7 +937,7 @@
               <w:rPr>
                 <w:noProof/>
               </w:rPr>
-              <w:instrText xml:space="preserve"> PAGEREF _Toc244001165 \h </w:instrText>
+              <w:instrText xml:space="preserve"> PAGEREF _Toc244019297 \h </w:instrText>
             </w:r>
             <w:r>
               <w:rPr>
@@ -888,7 +954,7 @@
               <w:rPr>
                 <w:noProof/>
               </w:rPr>
-              <w:t>5</w:t>
+              <w:t>6</w:t>
             </w:r>
             <w:r>
               <w:rPr>
@@ -913,7 +979,7 @@
               <w14:ligatures w14:val="standardContextual"/>
             </w:rPr>
           </w:pPr>
-          <w:hyperlink w:anchor="_Toc244001166" w:history="1">
+          <w:hyperlink w:anchor="_Toc244019298" w:history="1">
             <w:r>
               <w:rPr>
                 <w:rStyle w:val="Hipervnculo"/>
@@ -937,7 +1003,7 @@
               <w:rPr>
                 <w:noProof/>
               </w:rPr>
-              <w:instrText xml:space="preserve"> PAGEREF _Toc244001166 \h </w:instrText>
+              <w:instrText xml:space="preserve"> PAGEREF _Toc244019298 \h </w:instrText>
             </w:r>
             <w:r>
               <w:rPr>
@@ -979,7 +1045,7 @@
               <w14:ligatures w14:val="standardContextual"/>
             </w:rPr>
           </w:pPr>
-          <w:hyperlink w:anchor="_Toc244001167" w:history="1">
+          <w:hyperlink w:anchor="_Toc244019299" w:history="1">
             <w:r>
               <w:rPr>
                 <w:rStyle w:val="Hipervnculo"/>
@@ -1003,7 +1069,7 @@
               <w:rPr>
                 <w:noProof/>
               </w:rPr>
-              <w:instrText xml:space="preserve"> PAGEREF _Toc244001167 \h </w:instrText>
+              <w:instrText xml:space="preserve"> PAGEREF _Toc244019299 \h </w:instrText>
             </w:r>
             <w:r>
               <w:rPr>
@@ -1020,7 +1086,7 @@
               <w:rPr>
                 <w:noProof/>
               </w:rPr>
-              <w:t>6</w:t>
+              <w:t>7</w:t>
             </w:r>
             <w:r>
               <w:rPr>
@@ -1045,7 +1111,7 @@
               <w14:ligatures w14:val="standardContextual"/>
             </w:rPr>
           </w:pPr>
-          <w:hyperlink w:anchor="_Toc244001168" w:history="1">
+          <w:hyperlink w:anchor="_Toc244019300" w:history="1">
             <w:r>
               <w:rPr>
                 <w:rStyle w:val="Hipervnculo"/>
@@ -1069,7 +1135,7 @@
               <w:rPr>
                 <w:noProof/>
               </w:rPr>
-              <w:instrText xml:space="preserve"> PAGEREF _Toc244001168 \h </w:instrText>
+              <w:instrText xml:space="preserve"> PAGEREF _Toc244019300 \h </w:instrText>
             </w:r>
             <w:r>
               <w:rPr>
@@ -1086,7 +1152,7 @@
               <w:rPr>
                 <w:noProof/>
               </w:rPr>
-              <w:t>6</w:t>
+              <w:t>7</w:t>
             </w:r>
             <w:r>
               <w:rPr>
@@ -1111,7 +1177,7 @@
               <w14:ligatures w14:val="standardContextual"/>
             </w:rPr>
           </w:pPr>
-          <w:hyperlink w:anchor="_Toc244001169" w:history="1">
+          <w:hyperlink w:anchor="_Toc244019301" w:history="1">
             <w:r>
               <w:rPr>
                 <w:rStyle w:val="Hipervnculo"/>
@@ -1135,7 +1201,7 @@
               <w:rPr>
                 <w:noProof/>
               </w:rPr>
-              <w:instrText xml:space="preserve"> PAGEREF _Toc244001169 \h </w:instrText>
+              <w:instrText xml:space="preserve"> PAGEREF _Toc244019301 \h </w:instrText>
             </w:r>
             <w:r>
               <w:rPr>
@@ -1152,7 +1218,7 @@
               <w:rPr>
                 <w:noProof/>
               </w:rPr>
-              <w:t>6</w:t>
+              <w:t>7</w:t>
             </w:r>
             <w:r>
               <w:rPr>
@@ -1177,7 +1243,7 @@
               <w14:ligatures w14:val="standardContextual"/>
             </w:rPr>
           </w:pPr>
-          <w:hyperlink w:anchor="_Toc244001170" w:history="1">
+          <w:hyperlink w:anchor="_Toc244019302" w:history="1">
             <w:r>
               <w:rPr>
                 <w:rStyle w:val="Hipervnculo"/>
@@ -1201,7 +1267,7 @@
               <w:rPr>
                 <w:noProof/>
               </w:rPr>
-              <w:instrText xml:space="preserve"> PAGEREF _Toc244001170 \h </w:instrText>
+              <w:instrText xml:space="preserve"> PAGEREF _Toc244019302 \h </w:instrText>
             </w:r>
             <w:r>
               <w:rPr>
@@ -1218,7 +1284,7 @@
               <w:rPr>
                 <w:noProof/>
               </w:rPr>
-              <w:t>7</w:t>
+              <w:t>8</w:t>
             </w:r>
             <w:r>
               <w:rPr>
@@ -1243,7 +1309,7 @@
               <w14:ligatures w14:val="standardContextual"/>
             </w:rPr>
           </w:pPr>
-          <w:hyperlink w:anchor="_Toc244001171" w:history="1">
+          <w:hyperlink w:anchor="_Toc244019303" w:history="1">
             <w:r>
               <w:rPr>
                 <w:rStyle w:val="Hipervnculo"/>
@@ -1267,7 +1333,7 @@
               <w:rPr>
                 <w:noProof/>
               </w:rPr>
-              <w:instrText xml:space="preserve"> PAGEREF _Toc244001171 \h </w:instrText>
+              <w:instrText xml:space="preserve"> PAGEREF _Toc244019303 \h </w:instrText>
             </w:r>
             <w:r>
               <w:rPr>
@@ -1284,7 +1350,7 @@
               <w:rPr>
                 <w:noProof/>
               </w:rPr>
-              <w:t>7</w:t>
+              <w:t>8</w:t>
             </w:r>
             <w:r>
               <w:rPr>
@@ -1309,7 +1375,7 @@
               <w14:ligatures w14:val="standardContextual"/>
             </w:rPr>
           </w:pPr>
-          <w:hyperlink w:anchor="_Toc244001172" w:history="1">
+          <w:hyperlink w:anchor="_Toc244019304" w:history="1">
             <w:r>
               <w:rPr>
                 <w:rStyle w:val="Hipervnculo"/>
@@ -1333,7 +1399,7 @@
               <w:rPr>
                 <w:noProof/>
               </w:rPr>
-              <w:instrText xml:space="preserve"> PAGEREF _Toc244001172 \h </w:instrText>
+              <w:instrText xml:space="preserve"> PAGEREF _Toc244019304 \h </w:instrText>
             </w:r>
             <w:r>
               <w:rPr>
@@ -1350,7 +1416,7 @@
               <w:rPr>
                 <w:noProof/>
               </w:rPr>
-              <w:t>9</w:t>
+              <w:t>10</w:t>
             </w:r>
             <w:r>
               <w:rPr>
@@ -1375,7 +1441,7 @@
               <w14:ligatures w14:val="standardContextual"/>
             </w:rPr>
           </w:pPr>
-          <w:hyperlink w:anchor="_Toc244001173" w:history="1">
+          <w:hyperlink w:anchor="_Toc244019305" w:history="1">
             <w:r>
               <w:rPr>
                 <w:rStyle w:val="Hipervnculo"/>
@@ -1399,7 +1465,7 @@
               <w:rPr>
                 <w:noProof/>
               </w:rPr>
-              <w:instrText xml:space="preserve"> PAGEREF _Toc244001173 \h </w:instrText>
+              <w:instrText xml:space="preserve"> PAGEREF _Toc244019305 \h </w:instrText>
             </w:r>
             <w:r>
               <w:rPr>
@@ -1416,7 +1482,7 @@
               <w:rPr>
                 <w:noProof/>
               </w:rPr>
-              <w:t>9</w:t>
+              <w:t>10</w:t>
             </w:r>
             <w:r>
               <w:rPr>
@@ -1441,7 +1507,7 @@
               <w14:ligatures w14:val="standardContextual"/>
             </w:rPr>
           </w:pPr>
-          <w:hyperlink w:anchor="_Toc244001174" w:history="1">
+          <w:hyperlink w:anchor="_Toc244019306" w:history="1">
             <w:r>
               <w:rPr>
                 <w:rStyle w:val="Hipervnculo"/>
@@ -1465,7 +1531,7 @@
               <w:rPr>
                 <w:noProof/>
               </w:rPr>
-              <w:instrText xml:space="preserve"> PAGEREF _Toc244001174 \h </w:instrText>
+              <w:instrText xml:space="preserve"> PAGEREF _Toc244019306 \h </w:instrText>
             </w:r>
             <w:r>
               <w:rPr>
@@ -1482,7 +1548,7 @@
               <w:rPr>
                 <w:noProof/>
               </w:rPr>
-              <w:t>9</w:t>
+              <w:t>10</w:t>
             </w:r>
             <w:r>
               <w:rPr>
@@ -1507,7 +1573,7 @@
               <w14:ligatures w14:val="standardContextual"/>
             </w:rPr>
           </w:pPr>
-          <w:hyperlink w:anchor="_Toc244001175" w:history="1">
+          <w:hyperlink w:anchor="_Toc244019307" w:history="1">
             <w:r>
               <w:rPr>
                 <w:rStyle w:val="Hipervnculo"/>
@@ -1531,7 +1597,7 @@
               <w:rPr>
                 <w:noProof/>
               </w:rPr>
-              <w:instrText xml:space="preserve"> PAGEREF _Toc244001175 \h </w:instrText>
+              <w:instrText xml:space="preserve"> PAGEREF _Toc244019307 \h </w:instrText>
             </w:r>
             <w:r>
               <w:rPr>
@@ -1548,7 +1614,7 @@
               <w:rPr>
                 <w:noProof/>
               </w:rPr>
-              <w:t>10</w:t>
+              <w:t>11</w:t>
             </w:r>
             <w:r>
               <w:rPr>
@@ -1573,7 +1639,7 @@
               <w14:ligatures w14:val="standardContextual"/>
             </w:rPr>
           </w:pPr>
-          <w:hyperlink w:anchor="_Toc244001176" w:history="1">
+          <w:hyperlink w:anchor="_Toc244019308" w:history="1">
             <w:r>
               <w:rPr>
                 <w:rStyle w:val="Hipervnculo"/>
@@ -1597,7 +1663,7 @@
               <w:rPr>
                 <w:noProof/>
               </w:rPr>
-              <w:instrText xml:space="preserve"> PAGEREF _Toc244001176 \h </w:instrText>
+              <w:instrText xml:space="preserve"> PAGEREF _Toc244019308 \h </w:instrText>
             </w:r>
             <w:r>
               <w:rPr>
@@ -1614,7 +1680,7 @@
               <w:rPr>
                 <w:noProof/>
               </w:rPr>
-              <w:t>10</w:t>
+              <w:t>11</w:t>
             </w:r>
             <w:r>
               <w:rPr>
@@ -1641,7 +1707,7 @@
         <w:pStyle w:val="Ttulo1"/>
         <w:spacing w:before="360" w:after="160"/>
       </w:pPr>
-      <w:bookmarkStart w:id="0" w:name="_Toc244001155"/>
+      <w:bookmarkStart w:id="0" w:name="_Toc244019286"/>
       <w:r>
         <w:t>1. Introducción</w:t>
       </w:r>
@@ -1668,7 +1734,7 @@
         <w:pStyle w:val="Ttulo1"/>
         <w:spacing w:before="360" w:after="160"/>
       </w:pPr>
-      <w:bookmarkStart w:id="1" w:name="_Toc244001156"/>
+      <w:bookmarkStart w:id="1" w:name="_Toc244019287"/>
       <w:r>
         <w:t>2. Actividad 1 — Lectura y análisis</w:t>
       </w:r>
@@ -1679,7 +1745,7 @@
         <w:spacing w:after="120" w:line="276" w:lineRule="auto"/>
       </w:pPr>
       <w:r>
-        <w:t xml:space="preserve">Bibliografía: capítulo 16 de </w:t>
+        <w:t xml:space="preserve">Bibliografía: capítulo 16, “Scaling Strategies”, de </w:t>
       </w:r>
       <w:r>
         <w:rPr>
@@ -1689,18 +1755,7 @@
         <w:t>Lean Mobile App Development</w:t>
       </w:r>
       <w:r>
-        <w:t xml:space="preserve"> (van Drongelen, Krishnaswamy y Dennis, Packt, 2017), </w:t>
-      </w:r>
-      <w:r>
-        <w:rPr>
-          <w:b/>
-          <w:bCs/>
-          <w:highlight w:val="yellow"/>
-        </w:rPr>
-        <w:t>[COMPLETAR: título del capítulo 16]</w:t>
-      </w:r>
-      <w:r>
-        <w:t>.</w:t>
+        <w:t xml:space="preserve"> (van Drongelen, Krishnaswamy y Dennis, Packt, 2017).</w:t>
       </w:r>
     </w:p>
     <w:p>
@@ -1708,11 +1763,480 @@
         <w:pStyle w:val="Ttulo2"/>
         <w:spacing w:before="240" w:after="120"/>
       </w:pPr>
-      <w:bookmarkStart w:id="2" w:name="_Toc244001157"/>
-      <w:r>
-        <w:t>2.1 Desafíos comunes al escalar aplicaciones móviles</w:t>
+      <w:bookmarkStart w:id="2" w:name="_Toc244019288"/>
+      <w:r>
+        <w:t>2.1 Ideas centrales del capítulo 16</w:t>
       </w:r>
       <w:bookmarkEnd w:id="2"/>
+    </w:p>
+    <w:p>
+      <w:pPr>
+        <w:spacing w:after="120" w:line="276" w:lineRule="auto"/>
+      </w:pPr>
+      <w:r>
+        <w:t xml:space="preserve">El capítulo plantea que la escalabilidad parece un “problema de lujo”, pero que si la app tiene éxito el backend va a tener que crecer, y que los servicios en la nube simplifican mucho ese proceso. Su consigna central es </w:t>
+      </w:r>
+      <w:r>
+        <w:rPr>
+          <w:i/>
+          <w:iCs/>
+        </w:rPr>
+        <w:t>“Do not scale yet, but make your solution scalable”</w:t>
+      </w:r>
+      <w:r>
+        <w:t>: no escalar todavía, pero dejar la solución preparada para hacerlo. La tabla relaciona cada tema del capítulo con una decisión concreta de este trabajo:</w:t>
+      </w:r>
+    </w:p>
+    <w:tbl>
+      <w:tblPr>
+        <w:tblW w:w="9072" w:type="dxa"/>
+        <w:tblBorders>
+          <w:top w:val="single" w:sz="4" w:space="0" w:color="auto"/>
+          <w:left w:val="single" w:sz="4" w:space="0" w:color="auto"/>
+          <w:bottom w:val="single" w:sz="4" w:space="0" w:color="auto"/>
+          <w:right w:val="single" w:sz="4" w:space="0" w:color="auto"/>
+          <w:insideH w:val="single" w:sz="4" w:space="0" w:color="auto"/>
+          <w:insideV w:val="single" w:sz="4" w:space="0" w:color="auto"/>
+        </w:tblBorders>
+        <w:tblLook w:val="04A0" w:firstRow="1" w:lastRow="0" w:firstColumn="1" w:lastColumn="0" w:noHBand="0" w:noVBand="1"/>
+      </w:tblPr>
+      <w:tblGrid>
+        <w:gridCol w:w="3400"/>
+        <w:gridCol w:w="5672"/>
+      </w:tblGrid>
+      <w:tr>
+        <w:trPr>
+          <w:tblHeader/>
+        </w:trPr>
+        <w:tc>
+          <w:tcPr>
+            <w:tcW w:w="3400" w:type="dxa"/>
+            <w:tcBorders>
+              <w:top w:val="single" w:sz="4" w:space="0" w:color="CBD5E1"/>
+              <w:left w:val="single" w:sz="4" w:space="0" w:color="CBD5E1"/>
+              <w:bottom w:val="single" w:sz="4" w:space="0" w:color="CBD5E1"/>
+              <w:right w:val="single" w:sz="4" w:space="0" w:color="CBD5E1"/>
+            </w:tcBorders>
+            <w:shd w:val="clear" w:color="auto" w:fill="DBEAFE"/>
+            <w:tcMar>
+              <w:top w:w="60" w:type="dxa"/>
+              <w:left w:w="100" w:type="dxa"/>
+              <w:bottom w:w="60" w:type="dxa"/>
+              <w:right w:w="100" w:type="dxa"/>
+            </w:tcMar>
+          </w:tcPr>
+          <w:p>
+            <w:r>
+              <w:rPr>
+                <w:b/>
+                <w:bCs/>
+              </w:rPr>
+              <w:t>Tema del capítulo</w:t>
+            </w:r>
+          </w:p>
+        </w:tc>
+        <w:tc>
+          <w:tcPr>
+            <w:tcW w:w="5672" w:type="dxa"/>
+            <w:tcBorders>
+              <w:top w:val="single" w:sz="4" w:space="0" w:color="CBD5E1"/>
+              <w:left w:val="single" w:sz="4" w:space="0" w:color="CBD5E1"/>
+              <w:bottom w:val="single" w:sz="4" w:space="0" w:color="CBD5E1"/>
+              <w:right w:val="single" w:sz="4" w:space="0" w:color="CBD5E1"/>
+            </w:tcBorders>
+            <w:shd w:val="clear" w:color="auto" w:fill="DBEAFE"/>
+            <w:tcMar>
+              <w:top w:w="60" w:type="dxa"/>
+              <w:left w:w="100" w:type="dxa"/>
+              <w:bottom w:w="60" w:type="dxa"/>
+              <w:right w:w="100" w:type="dxa"/>
+            </w:tcMar>
+          </w:tcPr>
+          <w:p>
+            <w:r>
+              <w:rPr>
+                <w:b/>
+                <w:bCs/>
+              </w:rPr>
+              <w:t>Cómo lo aplicamos en Abrigate</w:t>
+            </w:r>
+          </w:p>
+        </w:tc>
+      </w:tr>
+      <w:tr>
+        <w:tc>
+          <w:tcPr>
+            <w:tcW w:w="3400" w:type="dxa"/>
+            <w:tcBorders>
+              <w:top w:val="single" w:sz="4" w:space="0" w:color="CBD5E1"/>
+              <w:left w:val="single" w:sz="4" w:space="0" w:color="CBD5E1"/>
+              <w:bottom w:val="single" w:sz="4" w:space="0" w:color="CBD5E1"/>
+              <w:right w:val="single" w:sz="4" w:space="0" w:color="CBD5E1"/>
+            </w:tcBorders>
+            <w:tcMar>
+              <w:top w:w="60" w:type="dxa"/>
+              <w:left w:w="100" w:type="dxa"/>
+              <w:bottom w:w="60" w:type="dxa"/>
+              <w:right w:w="100" w:type="dxa"/>
+            </w:tcMar>
+          </w:tcPr>
+          <w:p>
+            <w:r>
+              <w:rPr>
+                <w:b/>
+                <w:bCs/>
+              </w:rPr>
+              <w:t>Make it scalable but do not scale it right away</w:t>
+            </w:r>
+          </w:p>
+        </w:tc>
+        <w:tc>
+          <w:tcPr>
+            <w:tcW w:w="5672" w:type="dxa"/>
+            <w:tcBorders>
+              <w:top w:val="single" w:sz="4" w:space="0" w:color="CBD5E1"/>
+              <w:left w:val="single" w:sz="4" w:space="0" w:color="CBD5E1"/>
+              <w:bottom w:val="single" w:sz="4" w:space="0" w:color="CBD5E1"/>
+              <w:right w:val="single" w:sz="4" w:space="0" w:color="CBD5E1"/>
+            </w:tcBorders>
+            <w:tcMar>
+              <w:top w:w="60" w:type="dxa"/>
+              <w:left w:w="100" w:type="dxa"/>
+              <w:bottom w:w="60" w:type="dxa"/>
+              <w:right w:w="100" w:type="dxa"/>
+            </w:tcMar>
+          </w:tcPr>
+          <w:p>
+            <w:r>
+              <w:t>El servicio arranca en 0 instancias y con un techo de 10: está preparado para crecer, pero no se paga capacidad que hoy no se usa.</w:t>
+            </w:r>
+          </w:p>
+        </w:tc>
+      </w:tr>
+      <w:tr>
+        <w:tc>
+          <w:tcPr>
+            <w:tcW w:w="3400" w:type="dxa"/>
+            <w:tcBorders>
+              <w:top w:val="single" w:sz="4" w:space="0" w:color="CBD5E1"/>
+              <w:left w:val="single" w:sz="4" w:space="0" w:color="CBD5E1"/>
+              <w:bottom w:val="single" w:sz="4" w:space="0" w:color="CBD5E1"/>
+              <w:right w:val="single" w:sz="4" w:space="0" w:color="CBD5E1"/>
+            </w:tcBorders>
+            <w:tcMar>
+              <w:top w:w="60" w:type="dxa"/>
+              <w:left w:w="100" w:type="dxa"/>
+              <w:bottom w:w="60" w:type="dxa"/>
+              <w:right w:w="100" w:type="dxa"/>
+            </w:tcMar>
+          </w:tcPr>
+          <w:p>
+            <w:r>
+              <w:rPr>
+                <w:b/>
+                <w:bCs/>
+              </w:rPr>
+              <w:t>A scalable backend</w:t>
+            </w:r>
+          </w:p>
+        </w:tc>
+        <w:tc>
+          <w:tcPr>
+            <w:tcW w:w="5672" w:type="dxa"/>
+            <w:tcBorders>
+              <w:top w:val="single" w:sz="4" w:space="0" w:color="CBD5E1"/>
+              <w:left w:val="single" w:sz="4" w:space="0" w:color="CBD5E1"/>
+              <w:bottom w:val="single" w:sz="4" w:space="0" w:color="CBD5E1"/>
+              <w:right w:val="single" w:sz="4" w:space="0" w:color="CBD5E1"/>
+            </w:tcBorders>
+            <w:tcMar>
+              <w:top w:w="60" w:type="dxa"/>
+              <w:left w:w="100" w:type="dxa"/>
+              <w:bottom w:w="60" w:type="dxa"/>
+              <w:right w:w="100" w:type="dxa"/>
+            </w:tcMar>
+          </w:tcPr>
+          <w:p>
+            <w:r>
+              <w:t>Se agrega abrigate-api como backend propio, sin estado, para que cualquier instancia pueda atender cualquier pedido.</w:t>
+            </w:r>
+          </w:p>
+        </w:tc>
+      </w:tr>
+      <w:tr>
+        <w:tc>
+          <w:tcPr>
+            <w:tcW w:w="3400" w:type="dxa"/>
+            <w:tcBorders>
+              <w:top w:val="single" w:sz="4" w:space="0" w:color="CBD5E1"/>
+              <w:left w:val="single" w:sz="4" w:space="0" w:color="CBD5E1"/>
+              <w:bottom w:val="single" w:sz="4" w:space="0" w:color="CBD5E1"/>
+              <w:right w:val="single" w:sz="4" w:space="0" w:color="CBD5E1"/>
+            </w:tcBorders>
+            <w:tcMar>
+              <w:top w:w="60" w:type="dxa"/>
+              <w:left w:w="100" w:type="dxa"/>
+              <w:bottom w:w="60" w:type="dxa"/>
+              <w:right w:w="100" w:type="dxa"/>
+            </w:tcMar>
+          </w:tcPr>
+          <w:p>
+            <w:r>
+              <w:rPr>
+                <w:b/>
+                <w:bCs/>
+              </w:rPr>
+              <w:t>Cloud-based storage and processing</w:t>
+            </w:r>
+          </w:p>
+        </w:tc>
+        <w:tc>
+          <w:tcPr>
+            <w:tcW w:w="5672" w:type="dxa"/>
+            <w:tcBorders>
+              <w:top w:val="single" w:sz="4" w:space="0" w:color="CBD5E1"/>
+              <w:left w:val="single" w:sz="4" w:space="0" w:color="CBD5E1"/>
+              <w:bottom w:val="single" w:sz="4" w:space="0" w:color="CBD5E1"/>
+              <w:right w:val="single" w:sz="4" w:space="0" w:color="CBD5E1"/>
+            </w:tcBorders>
+            <w:tcMar>
+              <w:top w:w="60" w:type="dxa"/>
+              <w:left w:w="100" w:type="dxa"/>
+              <w:bottom w:w="60" w:type="dxa"/>
+              <w:right w:w="100" w:type="dxa"/>
+            </w:tcMar>
+          </w:tcPr>
+          <w:p>
+            <w:r>
+              <w:t>Se usan servicios gestionados de Google Cloud (Cloud Run, Secret Manager, Cloud Logging) en lugar de servidores propios.</w:t>
+            </w:r>
+          </w:p>
+        </w:tc>
+      </w:tr>
+      <w:tr>
+        <w:tc>
+          <w:tcPr>
+            <w:tcW w:w="3400" w:type="dxa"/>
+            <w:tcBorders>
+              <w:top w:val="single" w:sz="4" w:space="0" w:color="CBD5E1"/>
+              <w:left w:val="single" w:sz="4" w:space="0" w:color="CBD5E1"/>
+              <w:bottom w:val="single" w:sz="4" w:space="0" w:color="CBD5E1"/>
+              <w:right w:val="single" w:sz="4" w:space="0" w:color="CBD5E1"/>
+            </w:tcBorders>
+            <w:tcMar>
+              <w:top w:w="60" w:type="dxa"/>
+              <w:left w:w="100" w:type="dxa"/>
+              <w:bottom w:w="60" w:type="dxa"/>
+              <w:right w:w="100" w:type="dxa"/>
+            </w:tcMar>
+          </w:tcPr>
+          <w:p>
+            <w:r>
+              <w:rPr>
+                <w:b/>
+                <w:bCs/>
+              </w:rPr>
+              <w:t>Seen from a client perspective</w:t>
+            </w:r>
+          </w:p>
+        </w:tc>
+        <w:tc>
+          <w:tcPr>
+            <w:tcW w:w="5672" w:type="dxa"/>
+            <w:tcBorders>
+              <w:top w:val="single" w:sz="4" w:space="0" w:color="CBD5E1"/>
+              <w:left w:val="single" w:sz="4" w:space="0" w:color="CBD5E1"/>
+              <w:bottom w:val="single" w:sz="4" w:space="0" w:color="CBD5E1"/>
+              <w:right w:val="single" w:sz="4" w:space="0" w:color="CBD5E1"/>
+            </w:tcBorders>
+            <w:tcMar>
+              <w:top w:w="60" w:type="dxa"/>
+              <w:left w:w="100" w:type="dxa"/>
+              <w:bottom w:w="60" w:type="dxa"/>
+              <w:right w:w="100" w:type="dxa"/>
+            </w:tcMar>
+          </w:tcPr>
+          <w:p>
+            <w:r>
+              <w:t>Desde la app, el backend es una URL más. Si falla, la app muestra un mensaje en lugar de cerrarse (degradación elegante).</w:t>
+            </w:r>
+          </w:p>
+        </w:tc>
+      </w:tr>
+      <w:tr>
+        <w:tc>
+          <w:tcPr>
+            <w:tcW w:w="3400" w:type="dxa"/>
+            <w:tcBorders>
+              <w:top w:val="single" w:sz="4" w:space="0" w:color="CBD5E1"/>
+              <w:left w:val="single" w:sz="4" w:space="0" w:color="CBD5E1"/>
+              <w:bottom w:val="single" w:sz="4" w:space="0" w:color="CBD5E1"/>
+              <w:right w:val="single" w:sz="4" w:space="0" w:color="CBD5E1"/>
+            </w:tcBorders>
+            <w:tcMar>
+              <w:top w:w="60" w:type="dxa"/>
+              <w:left w:w="100" w:type="dxa"/>
+              <w:bottom w:w="60" w:type="dxa"/>
+              <w:right w:w="100" w:type="dxa"/>
+            </w:tcMar>
+          </w:tcPr>
+          <w:p>
+            <w:r>
+              <w:rPr>
+                <w:b/>
+                <w:bCs/>
+              </w:rPr>
+              <w:t>You should know when you need to scale up or to scale down</w:t>
+            </w:r>
+          </w:p>
+        </w:tc>
+        <w:tc>
+          <w:tcPr>
+            <w:tcW w:w="5672" w:type="dxa"/>
+            <w:tcBorders>
+              <w:top w:val="single" w:sz="4" w:space="0" w:color="CBD5E1"/>
+              <w:left w:val="single" w:sz="4" w:space="0" w:color="CBD5E1"/>
+              <w:bottom w:val="single" w:sz="4" w:space="0" w:color="CBD5E1"/>
+              <w:right w:val="single" w:sz="4" w:space="0" w:color="CBD5E1"/>
+            </w:tcBorders>
+            <w:tcMar>
+              <w:top w:w="60" w:type="dxa"/>
+              <w:left w:w="100" w:type="dxa"/>
+              <w:bottom w:w="60" w:type="dxa"/>
+              <w:right w:w="100" w:type="dxa"/>
+            </w:tcMar>
+          </w:tcPr>
+          <w:p>
+            <w:r>
+              <w:t>Cloud Logging registra el arranque de cada instancia y los errores; el endpoint /salud expone aciertos de caché y llamadas a OpenWeather.</w:t>
+            </w:r>
+          </w:p>
+        </w:tc>
+      </w:tr>
+      <w:tr>
+        <w:tc>
+          <w:tcPr>
+            <w:tcW w:w="3400" w:type="dxa"/>
+            <w:tcBorders>
+              <w:top w:val="single" w:sz="4" w:space="0" w:color="CBD5E1"/>
+              <w:left w:val="single" w:sz="4" w:space="0" w:color="CBD5E1"/>
+              <w:bottom w:val="single" w:sz="4" w:space="0" w:color="CBD5E1"/>
+              <w:right w:val="single" w:sz="4" w:space="0" w:color="CBD5E1"/>
+            </w:tcBorders>
+            <w:tcMar>
+              <w:top w:w="60" w:type="dxa"/>
+              <w:left w:w="100" w:type="dxa"/>
+              <w:bottom w:w="60" w:type="dxa"/>
+              <w:right w:w="100" w:type="dxa"/>
+            </w:tcMar>
+          </w:tcPr>
+          <w:p>
+            <w:r>
+              <w:rPr>
+                <w:b/>
+                <w:bCs/>
+              </w:rPr>
+              <w:t>To scale up or to refactor?</w:t>
+            </w:r>
+          </w:p>
+        </w:tc>
+        <w:tc>
+          <w:tcPr>
+            <w:tcW w:w="5672" w:type="dxa"/>
+            <w:tcBorders>
+              <w:top w:val="single" w:sz="4" w:space="0" w:color="CBD5E1"/>
+              <w:left w:val="single" w:sz="4" w:space="0" w:color="CBD5E1"/>
+              <w:bottom w:val="single" w:sz="4" w:space="0" w:color="CBD5E1"/>
+              <w:right w:val="single" w:sz="4" w:space="0" w:color="CBD5E1"/>
+            </w:tcBorders>
+            <w:tcMar>
+              <w:top w:w="60" w:type="dxa"/>
+              <w:left w:w="100" w:type="dxa"/>
+              <w:bottom w:w="60" w:type="dxa"/>
+              <w:right w:w="100" w:type="dxa"/>
+            </w:tcMar>
+          </w:tcPr>
+          <w:p>
+            <w:r>
+              <w:t>Agregar instancias no resolvía el límite de 1.000 llamadas diarias de OpenWeather. Se refactorizó la arquitectura (caché por zona) en lugar de solo sumar capacidad.</w:t>
+            </w:r>
+          </w:p>
+        </w:tc>
+      </w:tr>
+      <w:tr>
+        <w:tc>
+          <w:tcPr>
+            <w:tcW w:w="3400" w:type="dxa"/>
+            <w:tcBorders>
+              <w:top w:val="single" w:sz="4" w:space="0" w:color="CBD5E1"/>
+              <w:left w:val="single" w:sz="4" w:space="0" w:color="CBD5E1"/>
+              <w:bottom w:val="single" w:sz="4" w:space="0" w:color="CBD5E1"/>
+              <w:right w:val="single" w:sz="4" w:space="0" w:color="CBD5E1"/>
+            </w:tcBorders>
+            <w:tcMar>
+              <w:top w:w="60" w:type="dxa"/>
+              <w:left w:w="100" w:type="dxa"/>
+              <w:bottom w:w="60" w:type="dxa"/>
+              <w:right w:w="100" w:type="dxa"/>
+            </w:tcMar>
+          </w:tcPr>
+          <w:p>
+            <w:r>
+              <w:rPr>
+                <w:b/>
+                <w:bCs/>
+              </w:rPr>
+              <w:t>Auto-scaling</w:t>
+            </w:r>
+          </w:p>
+        </w:tc>
+        <w:tc>
+          <w:tcPr>
+            <w:tcW w:w="5672" w:type="dxa"/>
+            <w:tcBorders>
+              <w:top w:val="single" w:sz="4" w:space="0" w:color="CBD5E1"/>
+              <w:left w:val="single" w:sz="4" w:space="0" w:color="CBD5E1"/>
+              <w:bottom w:val="single" w:sz="4" w:space="0" w:color="CBD5E1"/>
+              <w:right w:val="single" w:sz="4" w:space="0" w:color="CBD5E1"/>
+            </w:tcBorders>
+            <w:tcMar>
+              <w:top w:w="60" w:type="dxa"/>
+              <w:left w:w="100" w:type="dxa"/>
+              <w:bottom w:w="60" w:type="dxa"/>
+              <w:right w:w="100" w:type="dxa"/>
+            </w:tcMar>
+          </w:tcPr>
+          <w:p>
+            <w:r>
+              <w:t>Cloud Run crea y apaga instancias según la concurrencia. La prueba de carga lo pasó de 1 a 9 instancias sin intervención.</w:t>
+            </w:r>
+          </w:p>
+        </w:tc>
+      </w:tr>
+    </w:tbl>
+    <w:p>
+      <w:pPr>
+        <w:spacing w:after="120"/>
+      </w:pPr>
+    </w:p>
+    <w:p>
+      <w:pPr>
+        <w:spacing w:after="120" w:line="276" w:lineRule="auto"/>
+      </w:pPr>
+      <w:r>
+        <w:t>Este enfoque es coherente con el capítulo 12 del mismo libro, “Do Things That Do Not Scale”, que pide validar primero las hipótesis y automatizar después: la integración directa de la app con OpenWeather sirvió para validar el MVP, y el backend escalable aparece recién cuando el crecimiento lo justifica.</w:t>
+      </w:r>
+    </w:p>
+    <w:p>
+      <w:pPr>
+        <w:pStyle w:val="Ttulo2"/>
+        <w:spacing w:before="240" w:after="120"/>
+      </w:pPr>
+      <w:bookmarkStart w:id="3" w:name="_Toc244019289"/>
+      <w:r>
+        <w:t>2.2 Desafíos comunes al escalar aplicaciones móviles</w:t>
+      </w:r>
+      <w:bookmarkEnd w:id="3"/>
     </w:p>
     <w:p>
       <w:pPr>
@@ -2159,11 +2683,11 @@
         <w:pStyle w:val="Ttulo2"/>
         <w:spacing w:before="240" w:after="120"/>
       </w:pPr>
-      <w:bookmarkStart w:id="3" w:name="_Toc244001158"/>
-      <w:r>
-        <w:t>2.2 Conclusión del análisis</w:t>
-      </w:r>
-      <w:bookmarkEnd w:id="3"/>
+      <w:bookmarkStart w:id="4" w:name="_Toc244019290"/>
+      <w:r>
+        <w:t>2.3 Conclusión del análisis</w:t>
+      </w:r>
+      <w:bookmarkEnd w:id="4"/>
     </w:p>
     <w:p>
       <w:pPr>
@@ -2198,22 +2722,22 @@
         <w:pStyle w:val="Ttulo1"/>
         <w:spacing w:before="360" w:after="160"/>
       </w:pPr>
-      <w:bookmarkStart w:id="4" w:name="_Toc244001159"/>
+      <w:bookmarkStart w:id="5" w:name="_Toc244019291"/>
       <w:r>
         <w:t>3. Entregable 1 — Estrategia de escalabilidad</w:t>
       </w:r>
-      <w:bookmarkEnd w:id="4"/>
+      <w:bookmarkEnd w:id="5"/>
     </w:p>
     <w:p>
       <w:pPr>
         <w:pStyle w:val="Ttulo2"/>
         <w:spacing w:before="240" w:after="120"/>
       </w:pPr>
-      <w:bookmarkStart w:id="5" w:name="_Toc244001160"/>
+      <w:bookmarkStart w:id="6" w:name="_Toc244019292"/>
       <w:r>
         <w:t>3.1 Idea central</w:t>
       </w:r>
-      <w:bookmarkEnd w:id="5"/>
+      <w:bookmarkEnd w:id="6"/>
     </w:p>
     <w:p>
       <w:pPr>
@@ -2318,11 +2842,11 @@
         <w:pStyle w:val="Ttulo2"/>
         <w:spacing w:before="240" w:after="120"/>
       </w:pPr>
-      <w:bookmarkStart w:id="6" w:name="_Toc244001161"/>
+      <w:bookmarkStart w:id="7" w:name="_Toc244019293"/>
       <w:r>
         <w:t>3.2 Autoescalado</w:t>
       </w:r>
-      <w:bookmarkEnd w:id="6"/>
+      <w:bookmarkEnd w:id="7"/>
     </w:p>
     <w:p>
       <w:pPr>
@@ -2787,11 +3311,11 @@
         <w:pStyle w:val="Ttulo2"/>
         <w:spacing w:before="240" w:after="120"/>
       </w:pPr>
-      <w:bookmarkStart w:id="7" w:name="_Toc244001162"/>
+      <w:bookmarkStart w:id="8" w:name="_Toc244019294"/>
       <w:r>
         <w:t>3.3 Balanceo de carga</w:t>
       </w:r>
-      <w:bookmarkEnd w:id="7"/>
+      <w:bookmarkEnd w:id="8"/>
     </w:p>
     <w:p>
       <w:pPr>
@@ -2821,11 +3345,11 @@
         <w:pStyle w:val="Ttulo2"/>
         <w:spacing w:before="240" w:after="120"/>
       </w:pPr>
-      <w:bookmarkStart w:id="8" w:name="_Toc244001163"/>
+      <w:bookmarkStart w:id="9" w:name="_Toc244019295"/>
       <w:r>
         <w:t>3.4 Redundancia</w:t>
       </w:r>
-      <w:bookmarkEnd w:id="8"/>
+      <w:bookmarkEnd w:id="9"/>
     </w:p>
     <w:p>
       <w:pPr>
@@ -2912,11 +3436,11 @@
         <w:pStyle w:val="Ttulo2"/>
         <w:spacing w:before="240" w:after="120"/>
       </w:pPr>
-      <w:bookmarkStart w:id="9" w:name="_Toc244001164"/>
+      <w:bookmarkStart w:id="10" w:name="_Toc244019296"/>
       <w:r>
         <w:t>3.5 Seguridad como parte de la escalabilidad</w:t>
       </w:r>
-      <w:bookmarkEnd w:id="9"/>
+      <w:bookmarkEnd w:id="10"/>
     </w:p>
     <w:p>
       <w:pPr>
@@ -2991,11 +3515,11 @@
         <w:pStyle w:val="Ttulo2"/>
         <w:spacing w:before="240" w:after="120"/>
       </w:pPr>
-      <w:bookmarkStart w:id="10" w:name="_Toc244001165"/>
+      <w:bookmarkStart w:id="11" w:name="_Toc244019297"/>
       <w:r>
         <w:t>3.6 Decisiones y compromisos</w:t>
       </w:r>
-      <w:bookmarkEnd w:id="10"/>
+      <w:bookmarkEnd w:id="11"/>
     </w:p>
     <w:tbl>
       <w:tblPr>
@@ -3384,11 +3908,11 @@
         <w:pStyle w:val="Ttulo2"/>
         <w:spacing w:before="240" w:after="120"/>
       </w:pPr>
-      <w:bookmarkStart w:id="11" w:name="_Toc244001166"/>
+      <w:bookmarkStart w:id="12" w:name="_Toc244019298"/>
       <w:r>
         <w:t>3.7 Capacidad estimada</w:t>
       </w:r>
-      <w:bookmarkEnd w:id="11"/>
+      <w:bookmarkEnd w:id="12"/>
     </w:p>
     <w:p>
       <w:pPr>
@@ -3421,22 +3945,22 @@
         <w:pStyle w:val="Ttulo1"/>
         <w:spacing w:before="360" w:after="160"/>
       </w:pPr>
-      <w:bookmarkStart w:id="12" w:name="_Toc244001167"/>
+      <w:bookmarkStart w:id="13" w:name="_Toc244019299"/>
       <w:r>
         <w:t>4. Entregable 2 — Configuración en la nube</w:t>
       </w:r>
-      <w:bookmarkEnd w:id="12"/>
+      <w:bookmarkEnd w:id="13"/>
     </w:p>
     <w:p>
       <w:pPr>
         <w:pStyle w:val="Ttulo2"/>
         <w:spacing w:before="240" w:after="120"/>
       </w:pPr>
-      <w:bookmarkStart w:id="13" w:name="_Toc244001168"/>
+      <w:bookmarkStart w:id="14" w:name="_Toc244019300"/>
       <w:r>
         <w:t>4.1 Recursos creados</w:t>
       </w:r>
-      <w:bookmarkEnd w:id="13"/>
+      <w:bookmarkEnd w:id="14"/>
     </w:p>
     <w:tbl>
       <w:tblPr>
@@ -3801,11 +4325,11 @@
         <w:pStyle w:val="Ttulo2"/>
         <w:spacing w:before="240" w:after="120"/>
       </w:pPr>
-      <w:bookmarkStart w:id="14" w:name="_Toc244001169"/>
+      <w:bookmarkStart w:id="15" w:name="_Toc244019301"/>
       <w:r>
         <w:t>4.2 Comandos de despliegue</w:t>
       </w:r>
-      <w:bookmarkEnd w:id="14"/>
+      <w:bookmarkEnd w:id="15"/>
     </w:p>
     <w:p>
       <w:pPr>
@@ -4018,11 +4542,11 @@
         <w:pStyle w:val="Ttulo2"/>
         <w:spacing w:before="240" w:after="120"/>
       </w:pPr>
-      <w:bookmarkStart w:id="15" w:name="_Toc244001170"/>
+      <w:bookmarkStart w:id="16" w:name="_Toc244019302"/>
       <w:r>
         <w:t>4.3 Funcionamiento del servicio</w:t>
       </w:r>
-      <w:bookmarkEnd w:id="15"/>
+      <w:bookmarkEnd w:id="16"/>
     </w:p>
     <w:p>
       <w:pPr>
@@ -4109,11 +4633,11 @@
         <w:pStyle w:val="Ttulo2"/>
         <w:spacing w:before="240" w:after="120"/>
       </w:pPr>
-      <w:bookmarkStart w:id="16" w:name="_Toc244001171"/>
+      <w:bookmarkStart w:id="17" w:name="_Toc244019303"/>
       <w:r>
         <w:t>4.4 Pruebas y evidencia</w:t>
       </w:r>
-      <w:bookmarkEnd w:id="16"/>
+      <w:bookmarkEnd w:id="17"/>
     </w:p>
     <w:p>
       <w:pPr>
@@ -5665,11 +6189,11 @@
         <w:pageBreakBefore/>
         <w:spacing w:after="160"/>
       </w:pPr>
-      <w:bookmarkStart w:id="17" w:name="_Toc244001172"/>
+      <w:bookmarkStart w:id="18" w:name="_Toc244019304"/>
       <w:r>
         <w:t>5. Entregable 3 — Diagrama de arquitectura actualizado</w:t>
       </w:r>
-      <w:bookmarkEnd w:id="17"/>
+      <w:bookmarkEnd w:id="18"/>
     </w:p>
     <w:p>
       <w:pPr>
@@ -5681,7 +6205,7 @@
           <w:noProof/>
         </w:rPr>
         <w:drawing>
-          <wp:inline distT="0" distB="0" distL="0" distR="0" wp14:anchorId="35F5B1EC" wp14:editId="2DB78998">
+          <wp:inline distT="0" distB="0" distL="0" distR="0" wp14:anchorId="37EE1B03" wp14:editId="448F1EA0">
             <wp:extent cx="5715000" cy="4286250"/>
             <wp:effectExtent l="0" t="0" r="0" b="0"/>
             <wp:docPr id="1" name="Imagen 1"/>
@@ -5741,11 +6265,11 @@
         <w:pStyle w:val="Ttulo2"/>
         <w:spacing w:before="240" w:after="120"/>
       </w:pPr>
-      <w:bookmarkStart w:id="18" w:name="_Toc244001173"/>
+      <w:bookmarkStart w:id="19" w:name="_Toc244019305"/>
       <w:r>
         <w:t>5.1 Cambios respecto de la arquitectura anterior</w:t>
       </w:r>
-      <w:bookmarkEnd w:id="18"/>
+      <w:bookmarkEnd w:id="19"/>
     </w:p>
     <w:p>
       <w:pPr>
@@ -5812,11 +6336,11 @@
         <w:pStyle w:val="Ttulo2"/>
         <w:spacing w:before="240" w:after="120"/>
       </w:pPr>
-      <w:bookmarkStart w:id="19" w:name="_Toc244001174"/>
+      <w:bookmarkStart w:id="20" w:name="_Toc244019306"/>
       <w:r>
         <w:t>5.2 Mecanismos de autoescalado representados</w:t>
       </w:r>
-      <w:bookmarkEnd w:id="19"/>
+      <w:bookmarkEnd w:id="20"/>
     </w:p>
     <w:p>
       <w:pPr>
@@ -5888,11 +6412,11 @@
         <w:pStyle w:val="Ttulo1"/>
         <w:spacing w:before="360" w:after="160"/>
       </w:pPr>
-      <w:bookmarkStart w:id="20" w:name="_Toc244001175"/>
+      <w:bookmarkStart w:id="21" w:name="_Toc244019307"/>
       <w:r>
         <w:t>6. Conclusiones</w:t>
       </w:r>
-      <w:bookmarkEnd w:id="20"/>
+      <w:bookmarkEnd w:id="21"/>
     </w:p>
     <w:p>
       <w:pPr>
@@ -5915,11 +6439,11 @@
         <w:pStyle w:val="Ttulo2"/>
         <w:spacing w:before="240" w:after="120"/>
       </w:pPr>
-      <w:bookmarkStart w:id="21" w:name="_Toc244001176"/>
+      <w:bookmarkStart w:id="22" w:name="_Toc244019308"/>
       <w:r>
         <w:t>Próximos pasos</w:t>
       </w:r>
-      <w:bookmarkEnd w:id="21"/>
+      <w:bookmarkEnd w:id="22"/>
     </w:p>
     <w:p>
       <w:pPr>
@@ -6071,211 +6595,211 @@
 <file path=word/numbering.xml><?xml version="1.0" encoding="utf-8"?>
 <w:numbering xmlns:wpc="http://schemas.microsoft.com/office/word/2010/wordprocessingCanvas" xmlns:cx="http://schemas.microsoft.com/office/drawing/2014/chartex" xmlns:cx1="http://schemas.microsoft.com/office/drawing/2015/9/8/chartex" xmlns:cx2="http://schemas.microsoft.com/office/drawing/2015/10/21/chartex" xmlns:cx3="http://schemas.microsoft.com/office/drawing/2016/5/9/chartex" xmlns:cx4="http://schemas.microsoft.com/office/drawing/2016/5/10/chartex" xmlns:cx5="http://schemas.microsoft.com/office/drawing/2016/5/11/chartex" xmlns:cx6="http://schemas.microsoft.com/office/drawing/2016/5/12/chartex" xmlns:cx7="http://schemas.microsoft.com/office/drawing/2016/5/13/chartex" xmlns:cx8="http://schemas.microsoft.com/office/drawing/2016/5/14/chartex" xmlns:mc="http://schemas.openxmlformats.org/markup-compatibility/2006" xmlns:aink="http://schemas.microsoft.com/office/drawing/2016/ink" xmlns:am3d="http://schemas.microsoft.com/office/drawing/2017/model3d" xmlns:o="urn:schemas-microsoft-com:office:office" xmlns:oel="http://schemas.microsoft.com/office/2019/extlst" xmlns:r="http://schemas.openxmlformats.org/officeDocument/2006/relationships" xmlns:m="http://schemas.openxmlformats.org/officeDocument/2006/math" xmlns:v="urn:schemas-microsoft-com:vml" xmlns:wp14="http://schemas.microsoft.com/office/word/2010/wordprocessingDrawing" xmlns:wp="http://schemas.openxmlformats.org/drawingml/2006/wordprocessingDrawing" xmlns:w10="urn:schemas-microsoft-com:office:word" xmlns:w="http://schemas.openxmlformats.org/wordprocessingml/2006/main" xmlns:w14="http://schemas.microsoft.com/office/word/2010/wordml" xmlns:w15="http://schemas.microsoft.com/office/word/2012/wordml" xmlns:w16cex="http://schemas.microsoft.com/office/word/2018/wordml/cex" xmlns:w16cid="http://schemas.microsoft.com/office/word/2016/wordml/cid" xmlns:w16="http://schemas.microsoft.com/office/word/2018/wordml" xmlns:w16du="http://schemas.microsoft.com/office/word/2023/wordml/word16du" xmlns:w16sdtdh="http://schemas.microsoft.com/office/word/2020/wordml/sdtdatahash" xmlns:w16sdtfl="http://schemas.microsoft.com/office/word/2024/wordml/sdtformatlock" xmlns:w16se="http://schemas.microsoft.com/office/word/2015/wordml/symex" xmlns:wpg="http://schemas.microsoft.com/office/word/2010/wordprocessingGroup" xmlns:wpi="http://schemas.microsoft.com/office/word/2010/wordprocessingInk" xmlns:wne="http://schemas.microsoft.com/office/word/2006/wordml" xmlns:wps="http://schemas.microsoft.com/office/word/2010/wordprocessingShape" mc:Ignorable="w14 w15 w16se w16cid w16 w16cex w16sdtdh w16sdtfl w16du wp14">
   <w:abstractNum w:abstractNumId="0" w15:restartNumberingAfterBreak="0">
-    <w:nsid w:val="3FB54B1B"/>
+    <w:nsid w:val="06F10535"/>
     <w:multiLevelType w:val="hybridMultilevel"/>
-    <w:tmpl w:val="3FACF3A8"/>
-    <w:lvl w:ilvl="0" w:tplc="2BB08118">
+    <w:tmpl w:val="DACC8766"/>
+    <w:lvl w:ilvl="0" w:tplc="B71C462C">
       <w:start w:val="1"/>
-      <w:numFmt w:val="bullet"/>
-      <w:lvlText w:val="•"/>
+      <w:numFmt w:val="decimal"/>
+      <w:lvlText w:val="%1."/>
       <w:lvlJc w:val="left"/>
       <w:pPr>
-        <w:ind w:left="540" w:hanging="270"/>
+        <w:ind w:left="540" w:hanging="300"/>
       </w:pPr>
     </w:lvl>
-    <w:lvl w:ilvl="1" w:tplc="098E0ACA" w:tentative="1">
-      <w:start w:val="1"/>
-      <w:numFmt w:val="bullet"/>
-      <w:lvlText w:val="◦"/>
-      <w:lvlJc w:val="left"/>
-      <w:pPr>
-        <w:ind w:left="1080" w:hanging="270"/>
-      </w:pPr>
-    </w:lvl>
-    <w:lvl w:ilvl="2" w:tplc="2700A90E">
+    <w:lvl w:ilvl="1" w:tplc="89A4E47A">
       <w:numFmt w:val="decimal"/>
       <w:lvlText w:val=""/>
       <w:lvlJc w:val="left"/>
     </w:lvl>
-    <w:lvl w:ilvl="3" w:tplc="091A9CD2">
+    <w:lvl w:ilvl="2" w:tplc="C3BEFDA4">
       <w:numFmt w:val="decimal"/>
       <w:lvlText w:val=""/>
       <w:lvlJc w:val="left"/>
     </w:lvl>
-    <w:lvl w:ilvl="4" w:tplc="D070E744">
+    <w:lvl w:ilvl="3" w:tplc="418E70CA">
       <w:numFmt w:val="decimal"/>
       <w:lvlText w:val=""/>
       <w:lvlJc w:val="left"/>
     </w:lvl>
-    <w:lvl w:ilvl="5" w:tplc="D4D82034">
+    <w:lvl w:ilvl="4" w:tplc="8F260ECC">
       <w:numFmt w:val="decimal"/>
       <w:lvlText w:val=""/>
       <w:lvlJc w:val="left"/>
     </w:lvl>
-    <w:lvl w:ilvl="6" w:tplc="F2E84576">
+    <w:lvl w:ilvl="5" w:tplc="2EA03266">
       <w:numFmt w:val="decimal"/>
       <w:lvlText w:val=""/>
       <w:lvlJc w:val="left"/>
     </w:lvl>
-    <w:lvl w:ilvl="7" w:tplc="1BCCD424">
+    <w:lvl w:ilvl="6" w:tplc="FDE25D4A">
       <w:numFmt w:val="decimal"/>
       <w:lvlText w:val=""/>
       <w:lvlJc w:val="left"/>
     </w:lvl>
-    <w:lvl w:ilvl="8" w:tplc="2358680A">
+    <w:lvl w:ilvl="7" w:tplc="4864B776">
+      <w:numFmt w:val="decimal"/>
+      <w:lvlText w:val=""/>
+      <w:lvlJc w:val="left"/>
+    </w:lvl>
+    <w:lvl w:ilvl="8" w:tplc="DE68E448">
       <w:numFmt w:val="decimal"/>
       <w:lvlText w:val=""/>
       <w:lvlJc w:val="left"/>
     </w:lvl>
   </w:abstractNum>
   <w:abstractNum w:abstractNumId="1" w15:restartNumberingAfterBreak="0">
-    <w:nsid w:val="51E61FD1"/>
+    <w:nsid w:val="525D6E2E"/>
     <w:multiLevelType w:val="hybridMultilevel"/>
-    <w:tmpl w:val="6062064E"/>
-    <w:lvl w:ilvl="0" w:tplc="3BB28956" w:tentative="1">
+    <w:tmpl w:val="34ECA442"/>
+    <w:lvl w:ilvl="0" w:tplc="F22E7D5E">
       <w:start w:val="1"/>
       <w:numFmt w:val="bullet"/>
-      <w:lvlText w:val="●"/>
+      <w:lvlText w:val="•"/>
       <w:lvlJc w:val="left"/>
       <w:pPr>
-        <w:ind w:left="720" w:hanging="360"/>
+        <w:ind w:left="540" w:hanging="270"/>
       </w:pPr>
     </w:lvl>
-    <w:lvl w:ilvl="1" w:tplc="3398C02C" w:tentative="1">
+    <w:lvl w:ilvl="1" w:tplc="DD8003D4" w:tentative="1">
       <w:start w:val="1"/>
       <w:numFmt w:val="bullet"/>
-      <w:lvlText w:val="○"/>
+      <w:lvlText w:val="◦"/>
       <w:lvlJc w:val="left"/>
       <w:pPr>
-        <w:ind w:left="1440" w:hanging="360"/>
+        <w:ind w:left="1080" w:hanging="270"/>
       </w:pPr>
     </w:lvl>
-    <w:lvl w:ilvl="2" w:tplc="FDBEEE7E" w:tentative="1">
-      <w:start w:val="1"/>
-      <w:numFmt w:val="bullet"/>
-      <w:lvlText w:val="■"/>
-      <w:lvlJc w:val="left"/>
-      <w:pPr>
-        <w:ind w:left="2160" w:hanging="360"/>
-      </w:pPr>
-    </w:lvl>
-    <w:lvl w:ilvl="3" w:tplc="13BC642A" w:tentative="1">
-      <w:start w:val="1"/>
-      <w:numFmt w:val="bullet"/>
-      <w:lvlText w:val="●"/>
-      <w:lvlJc w:val="left"/>
-      <w:pPr>
-        <w:ind w:left="2880" w:hanging="360"/>
-      </w:pPr>
-    </w:lvl>
-    <w:lvl w:ilvl="4" w:tplc="39A4D2D4" w:tentative="1">
-      <w:start w:val="1"/>
-      <w:numFmt w:val="bullet"/>
-      <w:lvlText w:val="○"/>
-      <w:lvlJc w:val="left"/>
-      <w:pPr>
-        <w:ind w:left="3600" w:hanging="360"/>
-      </w:pPr>
-    </w:lvl>
-    <w:lvl w:ilvl="5" w:tplc="B5CE2CCE" w:tentative="1">
-      <w:start w:val="1"/>
-      <w:numFmt w:val="bullet"/>
-      <w:lvlText w:val="■"/>
-      <w:lvlJc w:val="left"/>
-      <w:pPr>
-        <w:ind w:left="4320" w:hanging="360"/>
-      </w:pPr>
-    </w:lvl>
-    <w:lvl w:ilvl="6" w:tplc="26363226" w:tentative="1">
-      <w:start w:val="1"/>
-      <w:numFmt w:val="bullet"/>
-      <w:lvlText w:val="●"/>
-      <w:lvlJc w:val="left"/>
-      <w:pPr>
-        <w:ind w:left="5040" w:hanging="360"/>
-      </w:pPr>
-    </w:lvl>
-    <w:lvl w:ilvl="7" w:tplc="2C9A8D5E" w:tentative="1">
-      <w:start w:val="1"/>
-      <w:numFmt w:val="bullet"/>
-      <w:lvlText w:val="●"/>
-      <w:lvlJc w:val="left"/>
-      <w:pPr>
-        <w:ind w:left="5760" w:hanging="360"/>
-      </w:pPr>
-    </w:lvl>
-    <w:lvl w:ilvl="8" w:tplc="DE0AA8C4" w:tentative="1">
-      <w:start w:val="1"/>
-      <w:numFmt w:val="bullet"/>
-      <w:lvlText w:val="●"/>
-      <w:lvlJc w:val="left"/>
-      <w:pPr>
-        <w:ind w:left="6480" w:hanging="360"/>
-      </w:pPr>
-    </w:lvl>
-  </w:abstractNum>
-  <w:abstractNum w:abstractNumId="2" w15:restartNumberingAfterBreak="0">
-    <w:nsid w:val="788C7059"/>
-    <w:multiLevelType w:val="hybridMultilevel"/>
-    <w:tmpl w:val="B23644AA"/>
-    <w:lvl w:ilvl="0" w:tplc="B518FFA0">
-      <w:start w:val="1"/>
-      <w:numFmt w:val="decimal"/>
-      <w:lvlText w:val="%1."/>
-      <w:lvlJc w:val="left"/>
-      <w:pPr>
-        <w:ind w:left="540" w:hanging="300"/>
-      </w:pPr>
-    </w:lvl>
-    <w:lvl w:ilvl="1" w:tplc="5F1C116A">
+    <w:lvl w:ilvl="2" w:tplc="196CC80E">
       <w:numFmt w:val="decimal"/>
       <w:lvlText w:val=""/>
       <w:lvlJc w:val="left"/>
     </w:lvl>
-    <w:lvl w:ilvl="2" w:tplc="53B47BD2">
+    <w:lvl w:ilvl="3" w:tplc="6EC61FD8">
       <w:numFmt w:val="decimal"/>
       <w:lvlText w:val=""/>
       <w:lvlJc w:val="left"/>
     </w:lvl>
-    <w:lvl w:ilvl="3" w:tplc="B9A44A02">
+    <w:lvl w:ilvl="4" w:tplc="0D781500">
       <w:numFmt w:val="decimal"/>
       <w:lvlText w:val=""/>
       <w:lvlJc w:val="left"/>
     </w:lvl>
-    <w:lvl w:ilvl="4" w:tplc="C3FE8AB4">
+    <w:lvl w:ilvl="5" w:tplc="E22E9C4C">
       <w:numFmt w:val="decimal"/>
       <w:lvlText w:val=""/>
       <w:lvlJc w:val="left"/>
     </w:lvl>
-    <w:lvl w:ilvl="5" w:tplc="BF26AFFA">
+    <w:lvl w:ilvl="6" w:tplc="7B4C8BBC">
       <w:numFmt w:val="decimal"/>
       <w:lvlText w:val=""/>
       <w:lvlJc w:val="left"/>
     </w:lvl>
-    <w:lvl w:ilvl="6" w:tplc="BE08C170">
+    <w:lvl w:ilvl="7" w:tplc="2E5CEAA8">
       <w:numFmt w:val="decimal"/>
       <w:lvlText w:val=""/>
       <w:lvlJc w:val="left"/>
     </w:lvl>
-    <w:lvl w:ilvl="7" w:tplc="5E507710">
-      <w:numFmt w:val="decimal"/>
-      <w:lvlText w:val=""/>
-      <w:lvlJc w:val="left"/>
-    </w:lvl>
-    <w:lvl w:ilvl="8" w:tplc="20F491F2">
+    <w:lvl w:ilvl="8" w:tplc="F5F0B37A">
       <w:numFmt w:val="decimal"/>
       <w:lvlText w:val=""/>
       <w:lvlJc w:val="left"/>
     </w:lvl>
   </w:abstractNum>
-  <w:num w:numId="1" w16cid:durableId="354964520">
-    <w:abstractNumId w:val="1"/>
+  <w:abstractNum w:abstractNumId="2" w15:restartNumberingAfterBreak="0">
+    <w:nsid w:val="623C588B"/>
+    <w:multiLevelType w:val="hybridMultilevel"/>
+    <w:tmpl w:val="391E999E"/>
+    <w:lvl w:ilvl="0" w:tplc="EE3E6B70" w:tentative="1">
+      <w:start w:val="1"/>
+      <w:numFmt w:val="bullet"/>
+      <w:lvlText w:val="●"/>
+      <w:lvlJc w:val="left"/>
+      <w:pPr>
+        <w:ind w:left="720" w:hanging="360"/>
+      </w:pPr>
+    </w:lvl>
+    <w:lvl w:ilvl="1" w:tplc="0E7AC908" w:tentative="1">
+      <w:start w:val="1"/>
+      <w:numFmt w:val="bullet"/>
+      <w:lvlText w:val="○"/>
+      <w:lvlJc w:val="left"/>
+      <w:pPr>
+        <w:ind w:left="1440" w:hanging="360"/>
+      </w:pPr>
+    </w:lvl>
+    <w:lvl w:ilvl="2" w:tplc="F64AFD0A" w:tentative="1">
+      <w:start w:val="1"/>
+      <w:numFmt w:val="bullet"/>
+      <w:lvlText w:val="■"/>
+      <w:lvlJc w:val="left"/>
+      <w:pPr>
+        <w:ind w:left="2160" w:hanging="360"/>
+      </w:pPr>
+    </w:lvl>
+    <w:lvl w:ilvl="3" w:tplc="EBCCB720" w:tentative="1">
+      <w:start w:val="1"/>
+      <w:numFmt w:val="bullet"/>
+      <w:lvlText w:val="●"/>
+      <w:lvlJc w:val="left"/>
+      <w:pPr>
+        <w:ind w:left="2880" w:hanging="360"/>
+      </w:pPr>
+    </w:lvl>
+    <w:lvl w:ilvl="4" w:tplc="D58C0948" w:tentative="1">
+      <w:start w:val="1"/>
+      <w:numFmt w:val="bullet"/>
+      <w:lvlText w:val="○"/>
+      <w:lvlJc w:val="left"/>
+      <w:pPr>
+        <w:ind w:left="3600" w:hanging="360"/>
+      </w:pPr>
+    </w:lvl>
+    <w:lvl w:ilvl="5" w:tplc="4C001BC4" w:tentative="1">
+      <w:start w:val="1"/>
+      <w:numFmt w:val="bullet"/>
+      <w:lvlText w:val="■"/>
+      <w:lvlJc w:val="left"/>
+      <w:pPr>
+        <w:ind w:left="4320" w:hanging="360"/>
+      </w:pPr>
+    </w:lvl>
+    <w:lvl w:ilvl="6" w:tplc="AB04271E" w:tentative="1">
+      <w:start w:val="1"/>
+      <w:numFmt w:val="bullet"/>
+      <w:lvlText w:val="●"/>
+      <w:lvlJc w:val="left"/>
+      <w:pPr>
+        <w:ind w:left="5040" w:hanging="360"/>
+      </w:pPr>
+    </w:lvl>
+    <w:lvl w:ilvl="7" w:tplc="0E8EA5AC" w:tentative="1">
+      <w:start w:val="1"/>
+      <w:numFmt w:val="bullet"/>
+      <w:lvlText w:val="●"/>
+      <w:lvlJc w:val="left"/>
+      <w:pPr>
+        <w:ind w:left="5760" w:hanging="360"/>
+      </w:pPr>
+    </w:lvl>
+    <w:lvl w:ilvl="8" w:tplc="3A785830" w:tentative="1">
+      <w:start w:val="1"/>
+      <w:numFmt w:val="bullet"/>
+      <w:lvlText w:val="●"/>
+      <w:lvlJc w:val="left"/>
+      <w:pPr>
+        <w:ind w:left="6480" w:hanging="360"/>
+      </w:pPr>
+    </w:lvl>
+  </w:abstractNum>
+  <w:num w:numId="1" w16cid:durableId="768550224">
+    <w:abstractNumId w:val="2"/>
     <w:lvlOverride w:ilvl="0">
       <w:startOverride w:val="1"/>
     </w:lvlOverride>
   </w:num>
-  <w:num w:numId="2" w16cid:durableId="809903452">
-    <w:abstractNumId w:val="0"/>
+  <w:num w:numId="2" w16cid:durableId="1017200342">
+    <w:abstractNumId w:val="1"/>
     <w:lvlOverride w:ilvl="0">
       <w:startOverride w:val="1"/>
     </w:lvlOverride>
@@ -6283,8 +6807,8 @@
       <w:startOverride w:val="1"/>
     </w:lvlOverride>
   </w:num>
-  <w:num w:numId="3" w16cid:durableId="237518102">
-    <w:abstractNumId w:val="2"/>
+  <w:num w:numId="3" w16cid:durableId="742679030">
+    <w:abstractNumId w:val="0"/>
     <w:lvlOverride w:ilvl="0">
       <w:startOverride w:val="1"/>
     </w:lvlOverride>

</xml_diff>

<commit_message>
TP3: Actividad 1 según el capítulo 16 completo; diagnóstico de Abrigate pasa al Entregable 1
Co-Authored-By: Claude Opus 5.5 <noreply@anthropic.com>
</commit_message>
<xml_diff>
--- a/docs/TP3-Escalabilidad-Abrigate.docx
+++ b/docs/TP3-Escalabilidad-Abrigate.docx
@@ -155,7 +155,7 @@
     <w:sdt>
       <w:sdtPr>
         <w:alias w:val="Índice"/>
-        <w:id w:val="429866318"/>
+        <w:id w:val="-1597475164"/>
         <w:docPartObj>
           <w:docPartGallery w:val="Table of Contents"/>
           <w:docPartUnique/>
@@ -187,7 +187,7 @@
           <w:r>
             <w:fldChar w:fldCharType="separate"/>
           </w:r>
-          <w:hyperlink w:anchor="_Toc244019286" w:history="1">
+          <w:hyperlink w:anchor="_Toc244019677" w:history="1">
             <w:r>
               <w:rPr>
                 <w:rStyle w:val="Hipervnculo"/>
@@ -211,7 +211,7 @@
               <w:rPr>
                 <w:noProof/>
               </w:rPr>
-              <w:instrText xml:space="preserve"> PAGEREF _Toc244019286 \h </w:instrText>
+              <w:instrText xml:space="preserve"> PAGEREF _Toc244019677 \h </w:instrText>
             </w:r>
             <w:r>
               <w:rPr>
@@ -253,7 +253,7 @@
               <w14:ligatures w14:val="standardContextual"/>
             </w:rPr>
           </w:pPr>
-          <w:hyperlink w:anchor="_Toc244019287" w:history="1">
+          <w:hyperlink w:anchor="_Toc244019678" w:history="1">
             <w:r>
               <w:rPr>
                 <w:rStyle w:val="Hipervnculo"/>
@@ -277,7 +277,7 @@
               <w:rPr>
                 <w:noProof/>
               </w:rPr>
-              <w:instrText xml:space="preserve"> PAGEREF _Toc244019287 \h </w:instrText>
+              <w:instrText xml:space="preserve"> PAGEREF _Toc244019678 \h </w:instrText>
             </w:r>
             <w:r>
               <w:rPr>
@@ -319,13 +319,13 @@
               <w14:ligatures w14:val="standardContextual"/>
             </w:rPr>
           </w:pPr>
-          <w:hyperlink w:anchor="_Toc244019288" w:history="1">
+          <w:hyperlink w:anchor="_Toc244019679" w:history="1">
             <w:r>
               <w:rPr>
                 <w:rStyle w:val="Hipervnculo"/>
                 <w:noProof/>
               </w:rPr>
-              <w:t>2.1 Ideas centrales del capítulo 16</w:t>
+              <w:t>2.1 Síntesis del capítulo</w:t>
             </w:r>
             <w:r>
               <w:rPr>
@@ -343,7 +343,7 @@
               <w:rPr>
                 <w:noProof/>
               </w:rPr>
-              <w:instrText xml:space="preserve"> PAGEREF _Toc244019288 \h </w:instrText>
+              <w:instrText xml:space="preserve"> PAGEREF _Toc244019679 \h </w:instrText>
             </w:r>
             <w:r>
               <w:rPr>
@@ -385,7 +385,7 @@
               <w14:ligatures w14:val="standardContextual"/>
             </w:rPr>
           </w:pPr>
-          <w:hyperlink w:anchor="_Toc244019289" w:history="1">
+          <w:hyperlink w:anchor="_Toc244019680" w:history="1">
             <w:r>
               <w:rPr>
                 <w:rStyle w:val="Hipervnculo"/>
@@ -409,7 +409,7 @@
               <w:rPr>
                 <w:noProof/>
               </w:rPr>
-              <w:instrText xml:space="preserve"> PAGEREF _Toc244019289 \h </w:instrText>
+              <w:instrText xml:space="preserve"> PAGEREF _Toc244019680 \h </w:instrText>
             </w:r>
             <w:r>
               <w:rPr>
@@ -426,7 +426,7 @@
               <w:rPr>
                 <w:noProof/>
               </w:rPr>
-              <w:t>4</w:t>
+              <w:t>3</w:t>
             </w:r>
             <w:r>
               <w:rPr>
@@ -451,13 +451,13 @@
               <w14:ligatures w14:val="standardContextual"/>
             </w:rPr>
           </w:pPr>
-          <w:hyperlink w:anchor="_Toc244019290" w:history="1">
+          <w:hyperlink w:anchor="_Toc244019681" w:history="1">
             <w:r>
               <w:rPr>
                 <w:rStyle w:val="Hipervnculo"/>
                 <w:noProof/>
               </w:rPr>
-              <w:t>2.3 Conclusión del análisis</w:t>
+              <w:t>2.3 Buenas prácticas que propone el autor</w:t>
             </w:r>
             <w:r>
               <w:rPr>
@@ -475,7 +475,7 @@
               <w:rPr>
                 <w:noProof/>
               </w:rPr>
-              <w:instrText xml:space="preserve"> PAGEREF _Toc244019290 \h </w:instrText>
+              <w:instrText xml:space="preserve"> PAGEREF _Toc244019681 \h </w:instrText>
             </w:r>
             <w:r>
               <w:rPr>
@@ -493,6 +493,138 @@
                 <w:noProof/>
               </w:rPr>
               <w:t>4</w:t>
+            </w:r>
+            <w:r>
+              <w:rPr>
+                <w:noProof/>
+              </w:rPr>
+              <w:fldChar w:fldCharType="end"/>
+            </w:r>
+          </w:hyperlink>
+        </w:p>
+        <w:p>
+          <w:pPr>
+            <w:pStyle w:val="TDC2"/>
+            <w:tabs>
+              <w:tab w:val="right" w:leader="dot" w:pos="9062"/>
+            </w:tabs>
+            <w:rPr>
+              <w:rFonts w:asciiTheme="minorHAnsi" w:eastAsiaTheme="minorEastAsia" w:hAnsiTheme="minorHAnsi" w:cstheme="minorBidi"/>
+              <w:noProof/>
+              <w:kern w:val="2"/>
+              <w:sz w:val="24"/>
+              <w:szCs w:val="24"/>
+              <w14:ligatures w14:val="standardContextual"/>
+            </w:rPr>
+          </w:pPr>
+          <w:hyperlink w:anchor="_Toc244019682" w:history="1">
+            <w:r>
+              <w:rPr>
+                <w:rStyle w:val="Hipervnculo"/>
+                <w:noProof/>
+              </w:rPr>
+              <w:t>2.4 Autoescalado</w:t>
+            </w:r>
+            <w:r>
+              <w:rPr>
+                <w:noProof/>
+              </w:rPr>
+              <w:tab/>
+            </w:r>
+            <w:r>
+              <w:rPr>
+                <w:noProof/>
+              </w:rPr>
+              <w:fldChar w:fldCharType="begin"/>
+            </w:r>
+            <w:r>
+              <w:rPr>
+                <w:noProof/>
+              </w:rPr>
+              <w:instrText xml:space="preserve"> PAGEREF _Toc244019682 \h </w:instrText>
+            </w:r>
+            <w:r>
+              <w:rPr>
+                <w:noProof/>
+              </w:rPr>
+            </w:r>
+            <w:r>
+              <w:rPr>
+                <w:noProof/>
+              </w:rPr>
+              <w:fldChar w:fldCharType="separate"/>
+            </w:r>
+            <w:r>
+              <w:rPr>
+                <w:noProof/>
+              </w:rPr>
+              <w:t>5</w:t>
+            </w:r>
+            <w:r>
+              <w:rPr>
+                <w:noProof/>
+              </w:rPr>
+              <w:fldChar w:fldCharType="end"/>
+            </w:r>
+          </w:hyperlink>
+        </w:p>
+        <w:p>
+          <w:pPr>
+            <w:pStyle w:val="TDC2"/>
+            <w:tabs>
+              <w:tab w:val="right" w:leader="dot" w:pos="9062"/>
+            </w:tabs>
+            <w:rPr>
+              <w:rFonts w:asciiTheme="minorHAnsi" w:eastAsiaTheme="minorEastAsia" w:hAnsiTheme="minorHAnsi" w:cstheme="minorBidi"/>
+              <w:noProof/>
+              <w:kern w:val="2"/>
+              <w:sz w:val="24"/>
+              <w:szCs w:val="24"/>
+              <w14:ligatures w14:val="standardContextual"/>
+            </w:rPr>
+          </w:pPr>
+          <w:hyperlink w:anchor="_Toc244019683" w:history="1">
+            <w:r>
+              <w:rPr>
+                <w:rStyle w:val="Hipervnculo"/>
+                <w:noProof/>
+              </w:rPr>
+              <w:t>2.5 Conclusión de la discusión</w:t>
+            </w:r>
+            <w:r>
+              <w:rPr>
+                <w:noProof/>
+              </w:rPr>
+              <w:tab/>
+            </w:r>
+            <w:r>
+              <w:rPr>
+                <w:noProof/>
+              </w:rPr>
+              <w:fldChar w:fldCharType="begin"/>
+            </w:r>
+            <w:r>
+              <w:rPr>
+                <w:noProof/>
+              </w:rPr>
+              <w:instrText xml:space="preserve"> PAGEREF _Toc244019683 \h </w:instrText>
+            </w:r>
+            <w:r>
+              <w:rPr>
+                <w:noProof/>
+              </w:rPr>
+            </w:r>
+            <w:r>
+              <w:rPr>
+                <w:noProof/>
+              </w:rPr>
+              <w:fldChar w:fldCharType="separate"/>
+            </w:r>
+            <w:r>
+              <w:rPr>
+                <w:noProof/>
+              </w:rPr>
+              <w:t>5</w:t>
             </w:r>
             <w:r>
               <w:rPr>
@@ -517,7 +649,7 @@
               <w14:ligatures w14:val="standardContextual"/>
             </w:rPr>
           </w:pPr>
-          <w:hyperlink w:anchor="_Toc244019291" w:history="1">
+          <w:hyperlink w:anchor="_Toc244019684" w:history="1">
             <w:r>
               <w:rPr>
                 <w:rStyle w:val="Hipervnculo"/>
@@ -541,7 +673,7 @@
               <w:rPr>
                 <w:noProof/>
               </w:rPr>
-              <w:instrText xml:space="preserve"> PAGEREF _Toc244019291 \h </w:instrText>
+              <w:instrText xml:space="preserve"> PAGEREF _Toc244019684 \h </w:instrText>
             </w:r>
             <w:r>
               <w:rPr>
@@ -583,13 +715,13 @@
               <w14:ligatures w14:val="standardContextual"/>
             </w:rPr>
           </w:pPr>
-          <w:hyperlink w:anchor="_Toc244019292" w:history="1">
+          <w:hyperlink w:anchor="_Toc244019685" w:history="1">
             <w:r>
               <w:rPr>
                 <w:rStyle w:val="Hipervnculo"/>
                 <w:noProof/>
               </w:rPr>
-              <w:t>3.1 Idea central</w:t>
+              <w:t>3.1 Diagnóstico: los desafíos aplicados a Abrigate</w:t>
             </w:r>
             <w:r>
               <w:rPr>
@@ -607,7 +739,7 @@
               <w:rPr>
                 <w:noProof/>
               </w:rPr>
-              <w:instrText xml:space="preserve"> PAGEREF _Toc244019292 \h </w:instrText>
+              <w:instrText xml:space="preserve"> PAGEREF _Toc244019685 \h </w:instrText>
             </w:r>
             <w:r>
               <w:rPr>
@@ -649,13 +781,13 @@
               <w14:ligatures w14:val="standardContextual"/>
             </w:rPr>
           </w:pPr>
-          <w:hyperlink w:anchor="_Toc244019293" w:history="1">
+          <w:hyperlink w:anchor="_Toc244019686" w:history="1">
             <w:r>
               <w:rPr>
                 <w:rStyle w:val="Hipervnculo"/>
                 <w:noProof/>
               </w:rPr>
-              <w:t>3.2 Autoescalado</w:t>
+              <w:t>3.2 Idea central</w:t>
             </w:r>
             <w:r>
               <w:rPr>
@@ -673,7 +805,7 @@
               <w:rPr>
                 <w:noProof/>
               </w:rPr>
-              <w:instrText xml:space="preserve"> PAGEREF _Toc244019293 \h </w:instrText>
+              <w:instrText xml:space="preserve"> PAGEREF _Toc244019686 \h </w:instrText>
             </w:r>
             <w:r>
               <w:rPr>
@@ -690,7 +822,7 @@
               <w:rPr>
                 <w:noProof/>
               </w:rPr>
-              <w:t>5</w:t>
+              <w:t>6</w:t>
             </w:r>
             <w:r>
               <w:rPr>
@@ -715,13 +847,13 @@
               <w14:ligatures w14:val="standardContextual"/>
             </w:rPr>
           </w:pPr>
-          <w:hyperlink w:anchor="_Toc244019294" w:history="1">
+          <w:hyperlink w:anchor="_Toc244019687" w:history="1">
             <w:r>
               <w:rPr>
                 <w:rStyle w:val="Hipervnculo"/>
                 <w:noProof/>
               </w:rPr>
-              <w:t>3.3 Balanceo de carga</w:t>
+              <w:t>3.3 Autoescalado</w:t>
             </w:r>
             <w:r>
               <w:rPr>
@@ -739,7 +871,7 @@
               <w:rPr>
                 <w:noProof/>
               </w:rPr>
-              <w:instrText xml:space="preserve"> PAGEREF _Toc244019294 \h </w:instrText>
+              <w:instrText xml:space="preserve"> PAGEREF _Toc244019687 \h </w:instrText>
             </w:r>
             <w:r>
               <w:rPr>
@@ -756,7 +888,7 @@
               <w:rPr>
                 <w:noProof/>
               </w:rPr>
-              <w:t>5</w:t>
+              <w:t>6</w:t>
             </w:r>
             <w:r>
               <w:rPr>
@@ -781,13 +913,13 @@
               <w14:ligatures w14:val="standardContextual"/>
             </w:rPr>
           </w:pPr>
-          <w:hyperlink w:anchor="_Toc244019295" w:history="1">
+          <w:hyperlink w:anchor="_Toc244019688" w:history="1">
             <w:r>
               <w:rPr>
                 <w:rStyle w:val="Hipervnculo"/>
                 <w:noProof/>
               </w:rPr>
-              <w:t>3.4 Redundancia</w:t>
+              <w:t>3.4 Balanceo de carga</w:t>
             </w:r>
             <w:r>
               <w:rPr>
@@ -805,7 +937,7 @@
               <w:rPr>
                 <w:noProof/>
               </w:rPr>
-              <w:instrText xml:space="preserve"> PAGEREF _Toc244019295 \h </w:instrText>
+              <w:instrText xml:space="preserve"> PAGEREF _Toc244019688 \h </w:instrText>
             </w:r>
             <w:r>
               <w:rPr>
@@ -822,7 +954,7 @@
               <w:rPr>
                 <w:noProof/>
               </w:rPr>
-              <w:t>6</w:t>
+              <w:t>7</w:t>
             </w:r>
             <w:r>
               <w:rPr>
@@ -847,13 +979,13 @@
               <w14:ligatures w14:val="standardContextual"/>
             </w:rPr>
           </w:pPr>
-          <w:hyperlink w:anchor="_Toc244019296" w:history="1">
+          <w:hyperlink w:anchor="_Toc244019689" w:history="1">
             <w:r>
               <w:rPr>
                 <w:rStyle w:val="Hipervnculo"/>
                 <w:noProof/>
               </w:rPr>
-              <w:t>3.5 Seguridad como parte de la escalabilidad</w:t>
+              <w:t>3.5 Redundancia</w:t>
             </w:r>
             <w:r>
               <w:rPr>
@@ -871,7 +1003,7 @@
               <w:rPr>
                 <w:noProof/>
               </w:rPr>
-              <w:instrText xml:space="preserve"> PAGEREF _Toc244019296 \h </w:instrText>
+              <w:instrText xml:space="preserve"> PAGEREF _Toc244019689 \h </w:instrText>
             </w:r>
             <w:r>
               <w:rPr>
@@ -888,7 +1020,7 @@
               <w:rPr>
                 <w:noProof/>
               </w:rPr>
-              <w:t>6</w:t>
+              <w:t>7</w:t>
             </w:r>
             <w:r>
               <w:rPr>
@@ -913,13 +1045,13 @@
               <w14:ligatures w14:val="standardContextual"/>
             </w:rPr>
           </w:pPr>
-          <w:hyperlink w:anchor="_Toc244019297" w:history="1">
+          <w:hyperlink w:anchor="_Toc244019690" w:history="1">
             <w:r>
               <w:rPr>
                 <w:rStyle w:val="Hipervnculo"/>
                 <w:noProof/>
               </w:rPr>
-              <w:t>3.6 Decisiones y compromisos</w:t>
+              <w:t>3.6 Seguridad como parte de la escalabilidad</w:t>
             </w:r>
             <w:r>
               <w:rPr>
@@ -937,7 +1069,7 @@
               <w:rPr>
                 <w:noProof/>
               </w:rPr>
-              <w:instrText xml:space="preserve"> PAGEREF _Toc244019297 \h </w:instrText>
+              <w:instrText xml:space="preserve"> PAGEREF _Toc244019690 \h </w:instrText>
             </w:r>
             <w:r>
               <w:rPr>
@@ -954,7 +1086,7 @@
               <w:rPr>
                 <w:noProof/>
               </w:rPr>
-              <w:t>6</w:t>
+              <w:t>7</w:t>
             </w:r>
             <w:r>
               <w:rPr>
@@ -979,13 +1111,13 @@
               <w14:ligatures w14:val="standardContextual"/>
             </w:rPr>
           </w:pPr>
-          <w:hyperlink w:anchor="_Toc244019298" w:history="1">
+          <w:hyperlink w:anchor="_Toc244019691" w:history="1">
             <w:r>
               <w:rPr>
                 <w:rStyle w:val="Hipervnculo"/>
                 <w:noProof/>
               </w:rPr>
-              <w:t>3.7 Capacidad estimada</w:t>
+              <w:t>3.7 Decisiones y compromisos</w:t>
             </w:r>
             <w:r>
               <w:rPr>
@@ -1003,7 +1135,7 @@
               <w:rPr>
                 <w:noProof/>
               </w:rPr>
-              <w:instrText xml:space="preserve"> PAGEREF _Toc244019298 \h </w:instrText>
+              <w:instrText xml:space="preserve"> PAGEREF _Toc244019691 \h </w:instrText>
             </w:r>
             <w:r>
               <w:rPr>
@@ -1020,7 +1152,73 @@
               <w:rPr>
                 <w:noProof/>
               </w:rPr>
-              <w:t>6</w:t>
+              <w:t>7</w:t>
+            </w:r>
+            <w:r>
+              <w:rPr>
+                <w:noProof/>
+              </w:rPr>
+              <w:fldChar w:fldCharType="end"/>
+            </w:r>
+          </w:hyperlink>
+        </w:p>
+        <w:p>
+          <w:pPr>
+            <w:pStyle w:val="TDC2"/>
+            <w:tabs>
+              <w:tab w:val="right" w:leader="dot" w:pos="9062"/>
+            </w:tabs>
+            <w:rPr>
+              <w:rFonts w:asciiTheme="minorHAnsi" w:eastAsiaTheme="minorEastAsia" w:hAnsiTheme="minorHAnsi" w:cstheme="minorBidi"/>
+              <w:noProof/>
+              <w:kern w:val="2"/>
+              <w:sz w:val="24"/>
+              <w:szCs w:val="24"/>
+              <w14:ligatures w14:val="standardContextual"/>
+            </w:rPr>
+          </w:pPr>
+          <w:hyperlink w:anchor="_Toc244019692" w:history="1">
+            <w:r>
+              <w:rPr>
+                <w:rStyle w:val="Hipervnculo"/>
+                <w:noProof/>
+              </w:rPr>
+              <w:t>3.8 Capacidad estimada</w:t>
+            </w:r>
+            <w:r>
+              <w:rPr>
+                <w:noProof/>
+              </w:rPr>
+              <w:tab/>
+            </w:r>
+            <w:r>
+              <w:rPr>
+                <w:noProof/>
+              </w:rPr>
+              <w:fldChar w:fldCharType="begin"/>
+            </w:r>
+            <w:r>
+              <w:rPr>
+                <w:noProof/>
+              </w:rPr>
+              <w:instrText xml:space="preserve"> PAGEREF _Toc244019692 \h </w:instrText>
+            </w:r>
+            <w:r>
+              <w:rPr>
+                <w:noProof/>
+              </w:rPr>
+            </w:r>
+            <w:r>
+              <w:rPr>
+                <w:noProof/>
+              </w:rPr>
+              <w:fldChar w:fldCharType="separate"/>
+            </w:r>
+            <w:r>
+              <w:rPr>
+                <w:noProof/>
+              </w:rPr>
+              <w:t>8</w:t>
             </w:r>
             <w:r>
               <w:rPr>
@@ -1045,7 +1243,7 @@
               <w14:ligatures w14:val="standardContextual"/>
             </w:rPr>
           </w:pPr>
-          <w:hyperlink w:anchor="_Toc244019299" w:history="1">
+          <w:hyperlink w:anchor="_Toc244019693" w:history="1">
             <w:r>
               <w:rPr>
                 <w:rStyle w:val="Hipervnculo"/>
@@ -1069,7 +1267,7 @@
               <w:rPr>
                 <w:noProof/>
               </w:rPr>
-              <w:instrText xml:space="preserve"> PAGEREF _Toc244019299 \h </w:instrText>
+              <w:instrText xml:space="preserve"> PAGEREF _Toc244019693 \h </w:instrText>
             </w:r>
             <w:r>
               <w:rPr>
@@ -1086,7 +1284,7 @@
               <w:rPr>
                 <w:noProof/>
               </w:rPr>
-              <w:t>7</w:t>
+              <w:t>8</w:t>
             </w:r>
             <w:r>
               <w:rPr>
@@ -1111,7 +1309,7 @@
               <w14:ligatures w14:val="standardContextual"/>
             </w:rPr>
           </w:pPr>
-          <w:hyperlink w:anchor="_Toc244019300" w:history="1">
+          <w:hyperlink w:anchor="_Toc244019694" w:history="1">
             <w:r>
               <w:rPr>
                 <w:rStyle w:val="Hipervnculo"/>
@@ -1135,7 +1333,7 @@
               <w:rPr>
                 <w:noProof/>
               </w:rPr>
-              <w:instrText xml:space="preserve"> PAGEREF _Toc244019300 \h </w:instrText>
+              <w:instrText xml:space="preserve"> PAGEREF _Toc244019694 \h </w:instrText>
             </w:r>
             <w:r>
               <w:rPr>
@@ -1152,7 +1350,7 @@
               <w:rPr>
                 <w:noProof/>
               </w:rPr>
-              <w:t>7</w:t>
+              <w:t>8</w:t>
             </w:r>
             <w:r>
               <w:rPr>
@@ -1177,7 +1375,7 @@
               <w14:ligatures w14:val="standardContextual"/>
             </w:rPr>
           </w:pPr>
-          <w:hyperlink w:anchor="_Toc244019301" w:history="1">
+          <w:hyperlink w:anchor="_Toc244019695" w:history="1">
             <w:r>
               <w:rPr>
                 <w:rStyle w:val="Hipervnculo"/>
@@ -1201,7 +1399,7 @@
               <w:rPr>
                 <w:noProof/>
               </w:rPr>
-              <w:instrText xml:space="preserve"> PAGEREF _Toc244019301 \h </w:instrText>
+              <w:instrText xml:space="preserve"> PAGEREF _Toc244019695 \h </w:instrText>
             </w:r>
             <w:r>
               <w:rPr>
@@ -1218,7 +1416,7 @@
               <w:rPr>
                 <w:noProof/>
               </w:rPr>
-              <w:t>7</w:t>
+              <w:t>8</w:t>
             </w:r>
             <w:r>
               <w:rPr>
@@ -1243,7 +1441,7 @@
               <w14:ligatures w14:val="standardContextual"/>
             </w:rPr>
           </w:pPr>
-          <w:hyperlink w:anchor="_Toc244019302" w:history="1">
+          <w:hyperlink w:anchor="_Toc244019696" w:history="1">
             <w:r>
               <w:rPr>
                 <w:rStyle w:val="Hipervnculo"/>
@@ -1267,7 +1465,7 @@
               <w:rPr>
                 <w:noProof/>
               </w:rPr>
-              <w:instrText xml:space="preserve"> PAGEREF _Toc244019302 \h </w:instrText>
+              <w:instrText xml:space="preserve"> PAGEREF _Toc244019696 \h </w:instrText>
             </w:r>
             <w:r>
               <w:rPr>
@@ -1284,7 +1482,7 @@
               <w:rPr>
                 <w:noProof/>
               </w:rPr>
-              <w:t>8</w:t>
+              <w:t>9</w:t>
             </w:r>
             <w:r>
               <w:rPr>
@@ -1309,7 +1507,7 @@
               <w14:ligatures w14:val="standardContextual"/>
             </w:rPr>
           </w:pPr>
-          <w:hyperlink w:anchor="_Toc244019303" w:history="1">
+          <w:hyperlink w:anchor="_Toc244019697" w:history="1">
             <w:r>
               <w:rPr>
                 <w:rStyle w:val="Hipervnculo"/>
@@ -1333,7 +1531,7 @@
               <w:rPr>
                 <w:noProof/>
               </w:rPr>
-              <w:instrText xml:space="preserve"> PAGEREF _Toc244019303 \h </w:instrText>
+              <w:instrText xml:space="preserve"> PAGEREF _Toc244019697 \h </w:instrText>
             </w:r>
             <w:r>
               <w:rPr>
@@ -1350,7 +1548,7 @@
               <w:rPr>
                 <w:noProof/>
               </w:rPr>
-              <w:t>8</w:t>
+              <w:t>9</w:t>
             </w:r>
             <w:r>
               <w:rPr>
@@ -1375,7 +1573,7 @@
               <w14:ligatures w14:val="standardContextual"/>
             </w:rPr>
           </w:pPr>
-          <w:hyperlink w:anchor="_Toc244019304" w:history="1">
+          <w:hyperlink w:anchor="_Toc244019698" w:history="1">
             <w:r>
               <w:rPr>
                 <w:rStyle w:val="Hipervnculo"/>
@@ -1399,7 +1597,7 @@
               <w:rPr>
                 <w:noProof/>
               </w:rPr>
-              <w:instrText xml:space="preserve"> PAGEREF _Toc244019304 \h </w:instrText>
+              <w:instrText xml:space="preserve"> PAGEREF _Toc244019698 \h </w:instrText>
             </w:r>
             <w:r>
               <w:rPr>
@@ -1416,7 +1614,7 @@
               <w:rPr>
                 <w:noProof/>
               </w:rPr>
-              <w:t>10</w:t>
+              <w:t>11</w:t>
             </w:r>
             <w:r>
               <w:rPr>
@@ -1441,7 +1639,7 @@
               <w14:ligatures w14:val="standardContextual"/>
             </w:rPr>
           </w:pPr>
-          <w:hyperlink w:anchor="_Toc244019305" w:history="1">
+          <w:hyperlink w:anchor="_Toc244019699" w:history="1">
             <w:r>
               <w:rPr>
                 <w:rStyle w:val="Hipervnculo"/>
@@ -1465,7 +1663,7 @@
               <w:rPr>
                 <w:noProof/>
               </w:rPr>
-              <w:instrText xml:space="preserve"> PAGEREF _Toc244019305 \h </w:instrText>
+              <w:instrText xml:space="preserve"> PAGEREF _Toc244019699 \h </w:instrText>
             </w:r>
             <w:r>
               <w:rPr>
@@ -1482,7 +1680,7 @@
               <w:rPr>
                 <w:noProof/>
               </w:rPr>
-              <w:t>10</w:t>
+              <w:t>11</w:t>
             </w:r>
             <w:r>
               <w:rPr>
@@ -1507,7 +1705,7 @@
               <w14:ligatures w14:val="standardContextual"/>
             </w:rPr>
           </w:pPr>
-          <w:hyperlink w:anchor="_Toc244019306" w:history="1">
+          <w:hyperlink w:anchor="_Toc244019700" w:history="1">
             <w:r>
               <w:rPr>
                 <w:rStyle w:val="Hipervnculo"/>
@@ -1531,7 +1729,7 @@
               <w:rPr>
                 <w:noProof/>
               </w:rPr>
-              <w:instrText xml:space="preserve"> PAGEREF _Toc244019306 \h </w:instrText>
+              <w:instrText xml:space="preserve"> PAGEREF _Toc244019700 \h </w:instrText>
             </w:r>
             <w:r>
               <w:rPr>
@@ -1548,7 +1746,7 @@
               <w:rPr>
                 <w:noProof/>
               </w:rPr>
-              <w:t>10</w:t>
+              <w:t>11</w:t>
             </w:r>
             <w:r>
               <w:rPr>
@@ -1573,7 +1771,7 @@
               <w14:ligatures w14:val="standardContextual"/>
             </w:rPr>
           </w:pPr>
-          <w:hyperlink w:anchor="_Toc244019307" w:history="1">
+          <w:hyperlink w:anchor="_Toc244019701" w:history="1">
             <w:r>
               <w:rPr>
                 <w:rStyle w:val="Hipervnculo"/>
@@ -1597,7 +1795,7 @@
               <w:rPr>
                 <w:noProof/>
               </w:rPr>
-              <w:instrText xml:space="preserve"> PAGEREF _Toc244019307 \h </w:instrText>
+              <w:instrText xml:space="preserve"> PAGEREF _Toc244019701 \h </w:instrText>
             </w:r>
             <w:r>
               <w:rPr>
@@ -1614,7 +1812,7 @@
               <w:rPr>
                 <w:noProof/>
               </w:rPr>
-              <w:t>11</w:t>
+              <w:t>12</w:t>
             </w:r>
             <w:r>
               <w:rPr>
@@ -1639,7 +1837,7 @@
               <w14:ligatures w14:val="standardContextual"/>
             </w:rPr>
           </w:pPr>
-          <w:hyperlink w:anchor="_Toc244019308" w:history="1">
+          <w:hyperlink w:anchor="_Toc244019702" w:history="1">
             <w:r>
               <w:rPr>
                 <w:rStyle w:val="Hipervnculo"/>
@@ -1663,7 +1861,7 @@
               <w:rPr>
                 <w:noProof/>
               </w:rPr>
-              <w:instrText xml:space="preserve"> PAGEREF _Toc244019308 \h </w:instrText>
+              <w:instrText xml:space="preserve"> PAGEREF _Toc244019702 \h </w:instrText>
             </w:r>
             <w:r>
               <w:rPr>
@@ -1680,7 +1878,7 @@
               <w:rPr>
                 <w:noProof/>
               </w:rPr>
-              <w:t>11</w:t>
+              <w:t>12</w:t>
             </w:r>
             <w:r>
               <w:rPr>
@@ -1707,7 +1905,7 @@
         <w:pStyle w:val="Ttulo1"/>
         <w:spacing w:before="360" w:after="160"/>
       </w:pPr>
-      <w:bookmarkStart w:id="0" w:name="_Toc244019286"/>
+      <w:bookmarkStart w:id="0" w:name="_Toc244019677"/>
       <w:r>
         <w:t>1. Introducción</w:t>
       </w:r>
@@ -1734,7 +1932,7 @@
         <w:pStyle w:val="Ttulo1"/>
         <w:spacing w:before="360" w:after="160"/>
       </w:pPr>
-      <w:bookmarkStart w:id="1" w:name="_Toc244019287"/>
+      <w:bookmarkStart w:id="1" w:name="_Toc244019678"/>
       <w:r>
         <w:t>2. Actividad 1 — Lectura y análisis</w:t>
       </w:r>
@@ -1755,7 +1953,7 @@
         <w:t>Lean Mobile App Development</w:t>
       </w:r>
       <w:r>
-        <w:t xml:space="preserve"> (van Drongelen, Krishnaswamy y Dennis, Packt, 2017).</w:t>
+        <w:t xml:space="preserve"> (van Drongelen, Krishnaswamy y Dennis, Packt, 2017), páginas 397 a 415.</w:t>
       </w:r>
     </w:p>
     <w:p>
@@ -1763,9 +1961,9 @@
         <w:pStyle w:val="Ttulo2"/>
         <w:spacing w:before="240" w:after="120"/>
       </w:pPr>
-      <w:bookmarkStart w:id="2" w:name="_Toc244019288"/>
-      <w:r>
-        <w:t>2.1 Ideas centrales del capítulo 16</w:t>
+      <w:bookmarkStart w:id="2" w:name="_Toc244019679"/>
+      <w:r>
+        <w:t>2.1 Síntesis del capítulo</w:t>
       </w:r>
       <w:bookmarkEnd w:id="2"/>
     </w:p>
@@ -1774,7 +1972,15 @@
         <w:spacing w:after="120" w:line="276" w:lineRule="auto"/>
       </w:pPr>
       <w:r>
-        <w:t xml:space="preserve">El capítulo plantea que la escalabilidad parece un “problema de lujo”, pero que si la app tiene éxito el backend va a tener que crecer, y que los servicios en la nube simplifican mucho ese proceso. Su consigna central es </w:t>
+        <w:t>El capítulo retoma una idea de los capítulos anteriores: mientras las hipótesis del negocio no estén validadas, invertir tiempo en escalar es un desperdicio. Pero agrega un matiz importante: aunque no haga falta escalar todavía, sí hace falta tener pensado cómo hacerlo. Si la app se vuelve popular de golpe y el backend no aguanta, se cae, los usuarios se decepcionan, abandonan la app y el momento de crecimiento se pierde.</w:t>
+      </w:r>
+    </w:p>
+    <w:p>
+      <w:pPr>
+        <w:spacing w:after="120" w:line="276" w:lineRule="auto"/>
+      </w:pPr>
+      <w:r>
+        <w:t xml:space="preserve">La consigna que resume el capítulo es </w:t>
       </w:r>
       <w:r>
         <w:rPr>
@@ -1784,7 +1990,94 @@
         <w:t>“Do not scale yet, but make your solution scalable”</w:t>
       </w:r>
       <w:r>
-        <w:t>: no escalar todavía, pero dejar la solución preparada para hacerlo. La tabla relaciona cada tema del capítulo con una decisión concreta de este trabajo:</w:t>
+        <w:t>: no escalar todavía, pero dejar la solución preparada para escalar rápido cuando haga falta. El autor cierra con la misma idea: lo clave es una buena arquitectura y la capacidad de escalar, no la escala en sí.</w:t>
+      </w:r>
+    </w:p>
+    <w:p>
+      <w:pPr>
+        <w:spacing w:after="120" w:line="276" w:lineRule="auto"/>
+      </w:pPr>
+      <w:r>
+        <w:t>Otros puntos que plantea:</w:t>
+      </w:r>
+    </w:p>
+    <w:p>
+      <w:pPr>
+        <w:pStyle w:val="Prrafodelista"/>
+        <w:numPr>
+          <w:ilvl w:val="0"/>
+          <w:numId w:val="2"/>
+        </w:numPr>
+        <w:spacing w:after="80" w:line="276" w:lineRule="auto"/>
+      </w:pPr>
+      <w:r>
+        <w:rPr>
+          <w:b/>
+          <w:bCs/>
+        </w:rPr>
+        <w:t xml:space="preserve">La escalabilidad no es solo técnica. </w:t>
+      </w:r>
+      <w:r>
+        <w:t>Todo lo que requiere intervención humana (soporte, moderación de contenido, trámites regulatorios) limita cuánto puede crecer la app. Una solución es realmente escalable cuando sus servicios están casi totalmente automatizados.</w:t>
+      </w:r>
+    </w:p>
+    <w:p>
+      <w:pPr>
+        <w:pStyle w:val="Prrafodelista"/>
+        <w:numPr>
+          <w:ilvl w:val="0"/>
+          <w:numId w:val="2"/>
+        </w:numPr>
+        <w:spacing w:after="80" w:line="276" w:lineRule="auto"/>
+      </w:pPr>
+      <w:r>
+        <w:rPr>
+          <w:b/>
+          <w:bCs/>
+        </w:rPr>
+        <w:t xml:space="preserve">Depende del tipo de app. </w:t>
+      </w:r>
+      <w:r>
+        <w:t>Un juego sin backend, distribuido por las tiendas, escala casi solo. Una red social necesita un backend complejo que almacene y entregue texto, imágenes y video.</w:t>
+      </w:r>
+    </w:p>
+    <w:p>
+      <w:pPr>
+        <w:pStyle w:val="Prrafodelista"/>
+        <w:numPr>
+          <w:ilvl w:val="0"/>
+          <w:numId w:val="2"/>
+        </w:numPr>
+        <w:spacing w:after="80" w:line="276" w:lineRule="auto"/>
+      </w:pPr>
+      <w:r>
+        <w:rPr>
+          <w:b/>
+          <w:bCs/>
+        </w:rPr>
+        <w:t xml:space="preserve">Conviene usar la nube desde el principio. </w:t>
+      </w:r>
+      <w:r>
+        <w:t>Ante un pico repentino (la app aparece destacada en la tienda o la recomienda alguien influyente), agregar servidores y armar un balanceo de carga a las apuradas es mucho más difícil que escalar un servicio en la nube.</w:t>
+      </w:r>
+    </w:p>
+    <w:p>
+      <w:pPr>
+        <w:pStyle w:val="Ttulo2"/>
+        <w:spacing w:before="240" w:after="120"/>
+      </w:pPr>
+      <w:bookmarkStart w:id="3" w:name="_Toc244019680"/>
+      <w:r>
+        <w:t>2.2 Desafíos comunes al escalar aplicaciones móviles</w:t>
+      </w:r>
+      <w:bookmarkEnd w:id="3"/>
+    </w:p>
+    <w:p>
+      <w:pPr>
+        <w:spacing w:after="120" w:line="276" w:lineRule="auto"/>
+      </w:pPr>
+      <w:r>
+        <w:t>A partir de la lectura, en la discusión grupal identificamos estos desafíos:</w:t>
       </w:r>
     </w:p>
     <w:tbl>
@@ -1801,8 +2094,8 @@
         <w:tblLook w:val="04A0" w:firstRow="1" w:lastRow="0" w:firstColumn="1" w:lastColumn="0" w:noHBand="0" w:noVBand="1"/>
       </w:tblPr>
       <w:tblGrid>
-        <w:gridCol w:w="3400"/>
-        <w:gridCol w:w="5672"/>
+        <w:gridCol w:w="2600"/>
+        <w:gridCol w:w="6472"/>
       </w:tblGrid>
       <w:tr>
         <w:trPr>
@@ -1810,7 +2103,7 @@
         </w:trPr>
         <w:tc>
           <w:tcPr>
-            <w:tcW w:w="3400" w:type="dxa"/>
+            <w:tcW w:w="2600" w:type="dxa"/>
             <w:tcBorders>
               <w:top w:val="single" w:sz="4" w:space="0" w:color="CBD5E1"/>
               <w:left w:val="single" w:sz="4" w:space="0" w:color="CBD5E1"/>
@@ -1831,13 +2124,13 @@
                 <w:b/>
                 <w:bCs/>
               </w:rPr>
-              <w:t>Tema del capítulo</w:t>
-            </w:r>
-          </w:p>
-        </w:tc>
-        <w:tc>
-          <w:tcPr>
-            <w:tcW w:w="5672" w:type="dxa"/>
+              <w:t>Desafío</w:t>
+            </w:r>
+          </w:p>
+        </w:tc>
+        <w:tc>
+          <w:tcPr>
+            <w:tcW w:w="6472" w:type="dxa"/>
             <w:tcBorders>
               <w:top w:val="single" w:sz="4" w:space="0" w:color="CBD5E1"/>
               <w:left w:val="single" w:sz="4" w:space="0" w:color="CBD5E1"/>
@@ -1858,7 +2151,7 @@
                 <w:b/>
                 <w:bCs/>
               </w:rPr>
-              <w:t>Cómo lo aplicamos en Abrigate</w:t>
+              <w:t>Qué plantea el capítulo</w:t>
             </w:r>
           </w:p>
         </w:tc>
@@ -1866,7 +2159,7 @@
       <w:tr>
         <w:tc>
           <w:tcPr>
-            <w:tcW w:w="3400" w:type="dxa"/>
+            <w:tcW w:w="2600" w:type="dxa"/>
             <w:tcBorders>
               <w:top w:val="single" w:sz="4" w:space="0" w:color="CBD5E1"/>
               <w:left w:val="single" w:sz="4" w:space="0" w:color="CBD5E1"/>
@@ -1886,29 +2179,29 @@
                 <w:b/>
                 <w:bCs/>
               </w:rPr>
-              <w:t>Make it scalable but do not scale it right away</w:t>
-            </w:r>
-          </w:p>
-        </w:tc>
-        <w:tc>
-          <w:tcPr>
-            <w:tcW w:w="5672" w:type="dxa"/>
-            <w:tcBorders>
-              <w:top w:val="single" w:sz="4" w:space="0" w:color="CBD5E1"/>
-              <w:left w:val="single" w:sz="4" w:space="0" w:color="CBD5E1"/>
-              <w:bottom w:val="single" w:sz="4" w:space="0" w:color="CBD5E1"/>
-              <w:right w:val="single" w:sz="4" w:space="0" w:color="CBD5E1"/>
-            </w:tcBorders>
-            <w:tcMar>
-              <w:top w:w="60" w:type="dxa"/>
-              <w:left w:w="100" w:type="dxa"/>
-              <w:bottom w:w="60" w:type="dxa"/>
-              <w:right w:w="100" w:type="dxa"/>
-            </w:tcMar>
-          </w:tcPr>
-          <w:p>
-            <w:r>
-              <w:t>El servicio arranca en 0 instancias y con un techo de 10: está preparado para crecer, pero no se paga capacidad que hoy no se usa.</w:t>
+              <w:t>Picos de tráfico imprevistos</w:t>
+            </w:r>
+          </w:p>
+        </w:tc>
+        <w:tc>
+          <w:tcPr>
+            <w:tcW w:w="6472" w:type="dxa"/>
+            <w:tcBorders>
+              <w:top w:val="single" w:sz="4" w:space="0" w:color="CBD5E1"/>
+              <w:left w:val="single" w:sz="4" w:space="0" w:color="CBD5E1"/>
+              <w:bottom w:val="single" w:sz="4" w:space="0" w:color="CBD5E1"/>
+              <w:right w:val="single" w:sz="4" w:space="0" w:color="CBD5E1"/>
+            </w:tcBorders>
+            <w:tcMar>
+              <w:top w:w="60" w:type="dxa"/>
+              <w:left w:w="100" w:type="dxa"/>
+              <w:bottom w:w="60" w:type="dxa"/>
+              <w:right w:w="100" w:type="dxa"/>
+            </w:tcMar>
+          </w:tcPr>
+          <w:p>
+            <w:r>
+              <w:t>Algunos picos se pueden prever (feriados, eventos, campañas de precio), pero otros no: una app destacada puede crecer 150 % en un día. Si el backend no responde, la experiencia se degrada justo cuando más usuarios nuevos llegan.</w:t>
             </w:r>
           </w:p>
         </w:tc>
@@ -1916,7 +2209,7 @@
       <w:tr>
         <w:tc>
           <w:tcPr>
-            <w:tcW w:w="3400" w:type="dxa"/>
+            <w:tcW w:w="2600" w:type="dxa"/>
             <w:tcBorders>
               <w:top w:val="single" w:sz="4" w:space="0" w:color="CBD5E1"/>
               <w:left w:val="single" w:sz="4" w:space="0" w:color="CBD5E1"/>
@@ -1936,29 +2229,29 @@
                 <w:b/>
                 <w:bCs/>
               </w:rPr>
-              <w:t>A scalable backend</w:t>
-            </w:r>
-          </w:p>
-        </w:tc>
-        <w:tc>
-          <w:tcPr>
-            <w:tcW w:w="5672" w:type="dxa"/>
-            <w:tcBorders>
-              <w:top w:val="single" w:sz="4" w:space="0" w:color="CBD5E1"/>
-              <w:left w:val="single" w:sz="4" w:space="0" w:color="CBD5E1"/>
-              <w:bottom w:val="single" w:sz="4" w:space="0" w:color="CBD5E1"/>
-              <w:right w:val="single" w:sz="4" w:space="0" w:color="CBD5E1"/>
-            </w:tcBorders>
-            <w:tcMar>
-              <w:top w:w="60" w:type="dxa"/>
-              <w:left w:w="100" w:type="dxa"/>
-              <w:bottom w:w="60" w:type="dxa"/>
-              <w:right w:w="100" w:type="dxa"/>
-            </w:tcMar>
-          </w:tcPr>
-          <w:p>
-            <w:r>
-              <w:t>Se agrega abrigate-api como backend propio, sin estado, para que cualquier instancia pueda atender cualquier pedido.</w:t>
+              <w:t>Componentes del backend</w:t>
+            </w:r>
+          </w:p>
+        </w:tc>
+        <w:tc>
+          <w:tcPr>
+            <w:tcW w:w="6472" w:type="dxa"/>
+            <w:tcBorders>
+              <w:top w:val="single" w:sz="4" w:space="0" w:color="CBD5E1"/>
+              <w:left w:val="single" w:sz="4" w:space="0" w:color="CBD5E1"/>
+              <w:bottom w:val="single" w:sz="4" w:space="0" w:color="CBD5E1"/>
+              <w:right w:val="single" w:sz="4" w:space="0" w:color="CBD5E1"/>
+            </w:tcBorders>
+            <w:tcMar>
+              <w:top w:w="60" w:type="dxa"/>
+              <w:left w:w="100" w:type="dxa"/>
+              <w:bottom w:w="60" w:type="dxa"/>
+              <w:right w:w="100" w:type="dxa"/>
+            </w:tcMar>
+          </w:tcPr>
+          <w:p>
+            <w:r>
+              <w:t>Según el caso, hay que escalar la base de datos y su balanceo de carga, el servidor web y su balanceo, el almacenamiento de medios (imágenes, video, audio) y la entrega de contenido, como el streaming de video.</w:t>
             </w:r>
           </w:p>
         </w:tc>
@@ -1966,7 +2259,7 @@
       <w:tr>
         <w:tc>
           <w:tcPr>
-            <w:tcW w:w="3400" w:type="dxa"/>
+            <w:tcW w:w="2600" w:type="dxa"/>
             <w:tcBorders>
               <w:top w:val="single" w:sz="4" w:space="0" w:color="CBD5E1"/>
               <w:left w:val="single" w:sz="4" w:space="0" w:color="CBD5E1"/>
@@ -1986,29 +2279,29 @@
                 <w:b/>
                 <w:bCs/>
               </w:rPr>
-              <w:t>Cloud-based storage and processing</w:t>
-            </w:r>
-          </w:p>
-        </w:tc>
-        <w:tc>
-          <w:tcPr>
-            <w:tcW w:w="5672" w:type="dxa"/>
-            <w:tcBorders>
-              <w:top w:val="single" w:sz="4" w:space="0" w:color="CBD5E1"/>
-              <w:left w:val="single" w:sz="4" w:space="0" w:color="CBD5E1"/>
-              <w:bottom w:val="single" w:sz="4" w:space="0" w:color="CBD5E1"/>
-              <w:right w:val="single" w:sz="4" w:space="0" w:color="CBD5E1"/>
-            </w:tcBorders>
-            <w:tcMar>
-              <w:top w:w="60" w:type="dxa"/>
-              <w:left w:w="100" w:type="dxa"/>
-              <w:bottom w:w="60" w:type="dxa"/>
-              <w:right w:w="100" w:type="dxa"/>
-            </w:tcMar>
-          </w:tcPr>
-          <w:p>
-            <w:r>
-              <w:t>Se usan servicios gestionados de Google Cloud (Cloud Run, Secret Manager, Cloud Logging) en lugar de servidores propios.</w:t>
+              <w:t>Ancho de banda limitado</w:t>
+            </w:r>
+          </w:p>
+        </w:tc>
+        <w:tc>
+          <w:tcPr>
+            <w:tcW w:w="6472" w:type="dxa"/>
+            <w:tcBorders>
+              <w:top w:val="single" w:sz="4" w:space="0" w:color="CBD5E1"/>
+              <w:left w:val="single" w:sz="4" w:space="0" w:color="CBD5E1"/>
+              <w:bottom w:val="single" w:sz="4" w:space="0" w:color="CBD5E1"/>
+              <w:right w:val="single" w:sz="4" w:space="0" w:color="CBD5E1"/>
+            </w:tcBorders>
+            <w:tcMar>
+              <w:top w:w="60" w:type="dxa"/>
+              <w:left w:w="100" w:type="dxa"/>
+              <w:bottom w:w="60" w:type="dxa"/>
+              <w:right w:w="100" w:type="dxa"/>
+            </w:tcMar>
+          </w:tcPr>
+          <w:p>
+            <w:r>
+              <w:t>En el celular la conexión puede ser lenta. Hay que transferir la menor cantidad de datos posible, descargar miniaturas antes que imágenes completas, paginar los resultados y guardar datos en caché en el dispositivo.</w:t>
             </w:r>
           </w:p>
         </w:tc>
@@ -2016,7 +2309,7 @@
       <w:tr>
         <w:tc>
           <w:tcPr>
-            <w:tcW w:w="3400" w:type="dxa"/>
+            <w:tcW w:w="2600" w:type="dxa"/>
             <w:tcBorders>
               <w:top w:val="single" w:sz="4" w:space="0" w:color="CBD5E1"/>
               <w:left w:val="single" w:sz="4" w:space="0" w:color="CBD5E1"/>
@@ -2036,29 +2329,29 @@
                 <w:b/>
                 <w:bCs/>
               </w:rPr>
-              <w:t>Seen from a client perspective</w:t>
-            </w:r>
-          </w:p>
-        </w:tc>
-        <w:tc>
-          <w:tcPr>
-            <w:tcW w:w="5672" w:type="dxa"/>
-            <w:tcBorders>
-              <w:top w:val="single" w:sz="4" w:space="0" w:color="CBD5E1"/>
-              <w:left w:val="single" w:sz="4" w:space="0" w:color="CBD5E1"/>
-              <w:bottom w:val="single" w:sz="4" w:space="0" w:color="CBD5E1"/>
-              <w:right w:val="single" w:sz="4" w:space="0" w:color="CBD5E1"/>
-            </w:tcBorders>
-            <w:tcMar>
-              <w:top w:w="60" w:type="dxa"/>
-              <w:left w:w="100" w:type="dxa"/>
-              <w:bottom w:w="60" w:type="dxa"/>
-              <w:right w:w="100" w:type="dxa"/>
-            </w:tcMar>
-          </w:tcPr>
-          <w:p>
-            <w:r>
-              <w:t>Desde la app, el backend es una URL más. Si falla, la app muestra un mensaje en lugar de cerrarse (degradación elegante).</w:t>
+              <w:t>APIs no pensadas para móviles</w:t>
+            </w:r>
+          </w:p>
+        </w:tc>
+        <w:tc>
+          <w:tcPr>
+            <w:tcW w:w="6472" w:type="dxa"/>
+            <w:tcBorders>
+              <w:top w:val="single" w:sz="4" w:space="0" w:color="CBD5E1"/>
+              <w:left w:val="single" w:sz="4" w:space="0" w:color="CBD5E1"/>
+              <w:bottom w:val="single" w:sz="4" w:space="0" w:color="CBD5E1"/>
+              <w:right w:val="single" w:sz="4" w:space="0" w:color="CBD5E1"/>
+            </w:tcBorders>
+            <w:tcMar>
+              <w:top w:w="60" w:type="dxa"/>
+              <w:left w:w="100" w:type="dxa"/>
+              <w:bottom w:w="60" w:type="dxa"/>
+              <w:right w:w="100" w:type="dxa"/>
+            </w:tcMar>
+          </w:tcPr>
+          <w:p>
+            <w:r>
+              <w:t>Si los datos vienen de una API diseñada para un sitio web, puede hacer falta un middleware que optimice lo que llega a la app.</w:t>
             </w:r>
           </w:p>
         </w:tc>
@@ -2066,7 +2359,7 @@
       <w:tr>
         <w:tc>
           <w:tcPr>
-            <w:tcW w:w="3400" w:type="dxa"/>
+            <w:tcW w:w="2600" w:type="dxa"/>
             <w:tcBorders>
               <w:top w:val="single" w:sz="4" w:space="0" w:color="CBD5E1"/>
               <w:left w:val="single" w:sz="4" w:space="0" w:color="CBD5E1"/>
@@ -2086,29 +2379,29 @@
                 <w:b/>
                 <w:bCs/>
               </w:rPr>
-              <w:t>You should know when you need to scale up or to scale down</w:t>
-            </w:r>
-          </w:p>
-        </w:tc>
-        <w:tc>
-          <w:tcPr>
-            <w:tcW w:w="5672" w:type="dxa"/>
-            <w:tcBorders>
-              <w:top w:val="single" w:sz="4" w:space="0" w:color="CBD5E1"/>
-              <w:left w:val="single" w:sz="4" w:space="0" w:color="CBD5E1"/>
-              <w:bottom w:val="single" w:sz="4" w:space="0" w:color="CBD5E1"/>
-              <w:right w:val="single" w:sz="4" w:space="0" w:color="CBD5E1"/>
-            </w:tcBorders>
-            <w:tcMar>
-              <w:top w:w="60" w:type="dxa"/>
-              <w:left w:w="100" w:type="dxa"/>
-              <w:bottom w:w="60" w:type="dxa"/>
-              <w:right w:w="100" w:type="dxa"/>
-            </w:tcMar>
-          </w:tcPr>
-          <w:p>
-            <w:r>
-              <w:t>Cloud Logging registra el arranque de cada instancia y los errores; el endpoint /salud expone aciertos de caché y llamadas a OpenWeather.</w:t>
+              <w:t>Saber cuándo escalar</w:t>
+            </w:r>
+          </w:p>
+        </w:tc>
+        <w:tc>
+          <w:tcPr>
+            <w:tcW w:w="6472" w:type="dxa"/>
+            <w:tcBorders>
+              <w:top w:val="single" w:sz="4" w:space="0" w:color="CBD5E1"/>
+              <w:left w:val="single" w:sz="4" w:space="0" w:color="CBD5E1"/>
+              <w:bottom w:val="single" w:sz="4" w:space="0" w:color="CBD5E1"/>
+              <w:right w:val="single" w:sz="4" w:space="0" w:color="CBD5E1"/>
+            </w:tcBorders>
+            <w:tcMar>
+              <w:top w:w="60" w:type="dxa"/>
+              <w:left w:w="100" w:type="dxa"/>
+              <w:bottom w:w="60" w:type="dxa"/>
+              <w:right w:w="100" w:type="dxa"/>
+            </w:tcMar>
+          </w:tcPr>
+          <w:p>
+            <w:r>
+              <w:t>Lo que importa no es la cantidad total de usuarios, sino cuántos usan la app al mismo tiempo. Las métricas de uso, la estacionalidad y las zonas horarias indican cuándo escalar hacia arriba y cuándo hacia abajo.</w:t>
             </w:r>
           </w:p>
         </w:tc>
@@ -2116,7 +2409,7 @@
       <w:tr>
         <w:tc>
           <w:tcPr>
-            <w:tcW w:w="3400" w:type="dxa"/>
+            <w:tcW w:w="2600" w:type="dxa"/>
             <w:tcBorders>
               <w:top w:val="single" w:sz="4" w:space="0" w:color="CBD5E1"/>
               <w:left w:val="single" w:sz="4" w:space="0" w:color="CBD5E1"/>
@@ -2136,29 +2429,29 @@
                 <w:b/>
                 <w:bCs/>
               </w:rPr>
-              <w:t>To scale up or to refactor?</w:t>
-            </w:r>
-          </w:p>
-        </w:tc>
-        <w:tc>
-          <w:tcPr>
-            <w:tcW w:w="5672" w:type="dxa"/>
-            <w:tcBorders>
-              <w:top w:val="single" w:sz="4" w:space="0" w:color="CBD5E1"/>
-              <w:left w:val="single" w:sz="4" w:space="0" w:color="CBD5E1"/>
-              <w:bottom w:val="single" w:sz="4" w:space="0" w:color="CBD5E1"/>
-              <w:right w:val="single" w:sz="4" w:space="0" w:color="CBD5E1"/>
-            </w:tcBorders>
-            <w:tcMar>
-              <w:top w:w="60" w:type="dxa"/>
-              <w:left w:w="100" w:type="dxa"/>
-              <w:bottom w:w="60" w:type="dxa"/>
-              <w:right w:w="100" w:type="dxa"/>
-            </w:tcMar>
-          </w:tcPr>
-          <w:p>
-            <w:r>
-              <w:t>Agregar instancias no resolvía el límite de 1.000 llamadas diarias de OpenWeather. Se refactorizó la arquitectura (caché por zona) en lugar de solo sumar capacidad.</w:t>
+              <w:t>Elegir la plataforma</w:t>
+            </w:r>
+          </w:p>
+        </w:tc>
+        <w:tc>
+          <w:tcPr>
+            <w:tcW w:w="6472" w:type="dxa"/>
+            <w:tcBorders>
+              <w:top w:val="single" w:sz="4" w:space="0" w:color="CBD5E1"/>
+              <w:left w:val="single" w:sz="4" w:space="0" w:color="CBD5E1"/>
+              <w:bottom w:val="single" w:sz="4" w:space="0" w:color="CBD5E1"/>
+              <w:right w:val="single" w:sz="4" w:space="0" w:color="CBD5E1"/>
+            </w:tcBorders>
+            <w:tcMar>
+              <w:top w:w="60" w:type="dxa"/>
+              <w:left w:w="100" w:type="dxa"/>
+              <w:bottom w:w="60" w:type="dxa"/>
+              <w:right w:w="100" w:type="dxa"/>
+            </w:tcMar>
+          </w:tcPr>
+          <w:p>
+            <w:r>
+              <w:t>IaaS (AWS, Azure, Google Cloud) es más flexible y, a la larga, más barato. MBaaS (como Firebase) es más cómodo para empezar, pero su plan premium suele costar más y aumenta el riesgo de quedar atado al proveedor (vendor lock-in).</w:t>
             </w:r>
           </w:p>
         </w:tc>
@@ -2166,7 +2459,7 @@
       <w:tr>
         <w:tc>
           <w:tcPr>
-            <w:tcW w:w="3400" w:type="dxa"/>
+            <w:tcW w:w="2600" w:type="dxa"/>
             <w:tcBorders>
               <w:top w:val="single" w:sz="4" w:space="0" w:color="CBD5E1"/>
               <w:left w:val="single" w:sz="4" w:space="0" w:color="CBD5E1"/>
@@ -2186,29 +2479,129 @@
                 <w:b/>
                 <w:bCs/>
               </w:rPr>
-              <w:t>Auto-scaling</w:t>
-            </w:r>
-          </w:p>
-        </w:tc>
-        <w:tc>
-          <w:tcPr>
-            <w:tcW w:w="5672" w:type="dxa"/>
-            <w:tcBorders>
-              <w:top w:val="single" w:sz="4" w:space="0" w:color="CBD5E1"/>
-              <w:left w:val="single" w:sz="4" w:space="0" w:color="CBD5E1"/>
-              <w:bottom w:val="single" w:sz="4" w:space="0" w:color="CBD5E1"/>
-              <w:right w:val="single" w:sz="4" w:space="0" w:color="CBD5E1"/>
-            </w:tcBorders>
-            <w:tcMar>
-              <w:top w:w="60" w:type="dxa"/>
-              <w:left w:w="100" w:type="dxa"/>
-              <w:bottom w:w="60" w:type="dxa"/>
-              <w:right w:w="100" w:type="dxa"/>
-            </w:tcMar>
-          </w:tcPr>
-          <w:p>
-            <w:r>
-              <w:t>Cloud Run crea y apaga instancias según la concurrencia. La prueba de carga lo pasó de 1 a 9 instancias sin intervención.</w:t>
+              <w:t>Promesas sin pruebas de carga</w:t>
+            </w:r>
+          </w:p>
+        </w:tc>
+        <w:tc>
+          <w:tcPr>
+            <w:tcW w:w="6472" w:type="dxa"/>
+            <w:tcBorders>
+              <w:top w:val="single" w:sz="4" w:space="0" w:color="CBD5E1"/>
+              <w:left w:val="single" w:sz="4" w:space="0" w:color="CBD5E1"/>
+              <w:bottom w:val="single" w:sz="4" w:space="0" w:color="CBD5E1"/>
+              <w:right w:val="single" w:sz="4" w:space="0" w:color="CBD5E1"/>
+            </w:tcBorders>
+            <w:tcMar>
+              <w:top w:w="60" w:type="dxa"/>
+              <w:left w:w="100" w:type="dxa"/>
+              <w:bottom w:w="60" w:type="dxa"/>
+              <w:right w:w="100" w:type="dxa"/>
+            </w:tcMar>
+          </w:tcPr>
+          <w:p>
+            <w:r>
+              <w:t>El autor cuenta un caso real: una app para votar en un programa de TV cuyo backend prometía soportar 100.000 usuarios y colapsó con unos 40.000. Aunque la falla fue del backend, los usuarios culparon a la app y las malas reseñas quedaron.</w:t>
+            </w:r>
+          </w:p>
+        </w:tc>
+      </w:tr>
+      <w:tr>
+        <w:tc>
+          <w:tcPr>
+            <w:tcW w:w="2600" w:type="dxa"/>
+            <w:tcBorders>
+              <w:top w:val="single" w:sz="4" w:space="0" w:color="CBD5E1"/>
+              <w:left w:val="single" w:sz="4" w:space="0" w:color="CBD5E1"/>
+              <w:bottom w:val="single" w:sz="4" w:space="0" w:color="CBD5E1"/>
+              <w:right w:val="single" w:sz="4" w:space="0" w:color="CBD5E1"/>
+            </w:tcBorders>
+            <w:tcMar>
+              <w:top w:w="60" w:type="dxa"/>
+              <w:left w:w="100" w:type="dxa"/>
+              <w:bottom w:w="60" w:type="dxa"/>
+              <w:right w:w="100" w:type="dxa"/>
+            </w:tcMar>
+          </w:tcPr>
+          <w:p>
+            <w:r>
+              <w:rPr>
+                <w:b/>
+                <w:bCs/>
+              </w:rPr>
+              <w:t>Escalar o refactorizar</w:t>
+            </w:r>
+          </w:p>
+        </w:tc>
+        <w:tc>
+          <w:tcPr>
+            <w:tcW w:w="6472" w:type="dxa"/>
+            <w:tcBorders>
+              <w:top w:val="single" w:sz="4" w:space="0" w:color="CBD5E1"/>
+              <w:left w:val="single" w:sz="4" w:space="0" w:color="CBD5E1"/>
+              <w:bottom w:val="single" w:sz="4" w:space="0" w:color="CBD5E1"/>
+              <w:right w:val="single" w:sz="4" w:space="0" w:color="CBD5E1"/>
+            </w:tcBorders>
+            <w:tcMar>
+              <w:top w:w="60" w:type="dxa"/>
+              <w:left w:w="100" w:type="dxa"/>
+              <w:bottom w:w="60" w:type="dxa"/>
+              <w:right w:w="100" w:type="dxa"/>
+            </w:tcMar>
+          </w:tcPr>
+          <w:p>
+            <w:r>
+              <w:t>Agregar servidores no arregla una mala arquitectura: es un parche que desperdicia recursos y dinero. Si una arquitectura mejor rinde más sin sumar capacidad, es la opción preferible.</w:t>
+            </w:r>
+          </w:p>
+        </w:tc>
+      </w:tr>
+      <w:tr>
+        <w:tc>
+          <w:tcPr>
+            <w:tcW w:w="2600" w:type="dxa"/>
+            <w:tcBorders>
+              <w:top w:val="single" w:sz="4" w:space="0" w:color="CBD5E1"/>
+              <w:left w:val="single" w:sz="4" w:space="0" w:color="CBD5E1"/>
+              <w:bottom w:val="single" w:sz="4" w:space="0" w:color="CBD5E1"/>
+              <w:right w:val="single" w:sz="4" w:space="0" w:color="CBD5E1"/>
+            </w:tcBorders>
+            <w:tcMar>
+              <w:top w:w="60" w:type="dxa"/>
+              <w:left w:w="100" w:type="dxa"/>
+              <w:bottom w:w="60" w:type="dxa"/>
+              <w:right w:w="100" w:type="dxa"/>
+            </w:tcMar>
+          </w:tcPr>
+          <w:p>
+            <w:r>
+              <w:rPr>
+                <w:b/>
+                <w:bCs/>
+              </w:rPr>
+              <w:t>Costo</w:t>
+            </w:r>
+          </w:p>
+        </w:tc>
+        <w:tc>
+          <w:tcPr>
+            <w:tcW w:w="6472" w:type="dxa"/>
+            <w:tcBorders>
+              <w:top w:val="single" w:sz="4" w:space="0" w:color="CBD5E1"/>
+              <w:left w:val="single" w:sz="4" w:space="0" w:color="CBD5E1"/>
+              <w:bottom w:val="single" w:sz="4" w:space="0" w:color="CBD5E1"/>
+              <w:right w:val="single" w:sz="4" w:space="0" w:color="CBD5E1"/>
+            </w:tcBorders>
+            <w:tcMar>
+              <w:top w:w="60" w:type="dxa"/>
+              <w:left w:w="100" w:type="dxa"/>
+              <w:bottom w:w="60" w:type="dxa"/>
+              <w:right w:w="100" w:type="dxa"/>
+            </w:tcMar>
+          </w:tcPr>
+          <w:p>
+            <w:r>
+              <w:t>La nube es cómoda pero puede ser cara. Por eso es tan importante poder escalar hacia abajo cuando baja el tráfico, para no pagar recursos ociosos.</w:t>
             </w:r>
           </w:p>
         </w:tc>
@@ -2221,29 +2614,216 @@
     </w:p>
     <w:p>
       <w:pPr>
-        <w:spacing w:after="120" w:line="276" w:lineRule="auto"/>
-      </w:pPr>
-      <w:r>
-        <w:t>Este enfoque es coherente con el capítulo 12 del mismo libro, “Do Things That Do Not Scale”, que pide validar primero las hipótesis y automatizar después: la integración directa de la app con OpenWeather sirvió para validar el MVP, y el backend escalable aparece recién cuando el crecimiento lo justifica.</w:t>
-      </w:r>
-    </w:p>
-    <w:p>
-      <w:pPr>
         <w:pStyle w:val="Ttulo2"/>
         <w:spacing w:before="240" w:after="120"/>
       </w:pPr>
-      <w:bookmarkStart w:id="3" w:name="_Toc244019289"/>
-      <w:r>
-        <w:t>2.2 Desafíos comunes al escalar aplicaciones móviles</w:t>
-      </w:r>
-      <w:bookmarkEnd w:id="3"/>
+      <w:bookmarkStart w:id="4" w:name="_Toc244019681"/>
+      <w:r>
+        <w:t>2.3 Buenas prácticas que propone el autor</w:t>
+      </w:r>
+      <w:bookmarkEnd w:id="4"/>
+    </w:p>
+    <w:p>
+      <w:pPr>
+        <w:pStyle w:val="Prrafodelista"/>
+        <w:numPr>
+          <w:ilvl w:val="0"/>
+          <w:numId w:val="2"/>
+        </w:numPr>
+        <w:spacing w:after="80" w:line="276" w:lineRule="auto"/>
+      </w:pPr>
+      <w:r>
+        <w:t>Mantener la app lo más liviana posible y que el trabajo pesado lo haga el servidor (así también se cuida la batería del dispositivo).</w:t>
+      </w:r>
+    </w:p>
+    <w:p>
+      <w:pPr>
+        <w:pStyle w:val="Prrafodelista"/>
+        <w:numPr>
+          <w:ilvl w:val="0"/>
+          <w:numId w:val="2"/>
+        </w:numPr>
+        <w:spacing w:after="80" w:line="276" w:lineRule="auto"/>
+      </w:pPr>
+      <w:r>
+        <w:t>Mantenerlo simple: no escalar todavía, pero dejarlo preparado para escalar.</w:t>
+      </w:r>
+    </w:p>
+    <w:p>
+      <w:pPr>
+        <w:pStyle w:val="Prrafodelista"/>
+        <w:numPr>
+          <w:ilvl w:val="0"/>
+          <w:numId w:val="2"/>
+        </w:numPr>
+        <w:spacing w:after="80" w:line="276" w:lineRule="auto"/>
+      </w:pPr>
+      <w:r>
+        <w:t>Usar almacenamiento y despliegue en la nube.</w:t>
+      </w:r>
+    </w:p>
+    <w:p>
+      <w:pPr>
+        <w:pStyle w:val="Prrafodelista"/>
+        <w:numPr>
+          <w:ilvl w:val="0"/>
+          <w:numId w:val="2"/>
+        </w:numPr>
+        <w:spacing w:after="80" w:line="276" w:lineRule="auto"/>
+      </w:pPr>
+      <w:r>
+        <w:t>Considerar diseñar primero la interfaz (la API).</w:t>
+      </w:r>
+    </w:p>
+    <w:p>
+      <w:pPr>
+        <w:pStyle w:val="Prrafodelista"/>
+        <w:numPr>
+          <w:ilvl w:val="0"/>
+          <w:numId w:val="2"/>
+        </w:numPr>
+        <w:spacing w:after="80" w:line="276" w:lineRule="auto"/>
+      </w:pPr>
+      <w:r>
+        <w:t>Obtener buena información a través de analíticas.</w:t>
+      </w:r>
+    </w:p>
+    <w:p>
+      <w:pPr>
+        <w:pStyle w:val="Prrafodelista"/>
+        <w:numPr>
+          <w:ilvl w:val="0"/>
+          <w:numId w:val="2"/>
+        </w:numPr>
+        <w:spacing w:after="80" w:line="276" w:lineRule="auto"/>
+      </w:pPr>
+      <w:r>
+        <w:t>Seguir el mercado y planificar las campañas con cuidado.</w:t>
+      </w:r>
+    </w:p>
+    <w:p>
+      <w:pPr>
+        <w:pStyle w:val="Prrafodelista"/>
+        <w:numPr>
+          <w:ilvl w:val="0"/>
+          <w:numId w:val="2"/>
+        </w:numPr>
+        <w:spacing w:after="80" w:line="276" w:lineRule="auto"/>
+      </w:pPr>
+      <w:r>
+        <w:t>Minimizar el tráfico de datos y no transferir lo que no se va a usar.</w:t>
+      </w:r>
+    </w:p>
+    <w:p>
+      <w:pPr>
+        <w:pStyle w:val="Prrafodelista"/>
+        <w:numPr>
+          <w:ilvl w:val="0"/>
+          <w:numId w:val="2"/>
+        </w:numPr>
+        <w:spacing w:after="80" w:line="276" w:lineRule="auto"/>
+      </w:pPr>
+      <w:r>
+        <w:t>Usar autoescalado siempre que sea posible.</w:t>
+      </w:r>
     </w:p>
     <w:p>
       <w:pPr>
         <w:spacing w:after="120" w:line="276" w:lineRule="auto"/>
       </w:pPr>
       <w:r>
-        <w:t>En la discusión grupal identificamos los desafíos generales y, para cada uno, cómo se manifiesta concretamente en Abrigate:</w:t>
+        <w:t>Además, el capítulo señala los factores que influyen en la escalabilidad: la base de datos, el almacenamiento, el tamaño promedio del tráfico, la región de los servidores respecto de dónde están los usuarios y la elección entre MBaaS, hosting propio o nube.</w:t>
+      </w:r>
+    </w:p>
+    <w:p>
+      <w:pPr>
+        <w:pStyle w:val="Ttulo2"/>
+        <w:spacing w:before="240" w:after="120"/>
+      </w:pPr>
+      <w:bookmarkStart w:id="5" w:name="_Toc244019682"/>
+      <w:r>
+        <w:t>2.4 Autoescalado</w:t>
+      </w:r>
+      <w:bookmarkEnd w:id="5"/>
+    </w:p>
+    <w:p>
+      <w:pPr>
+        <w:spacing w:after="120" w:line="276" w:lineRule="auto"/>
+      </w:pPr>
+      <w:r>
+        <w:t>El capítulo muestra que plataformas como Azure y AWS escalan automáticamente: agregan instancias en las horas o días pico y las quitan cuando baja la demanda. Se puede escalar según el tráfico o según un horario (día y noche, fines de semana, duración de una campaña). En AWS, el monitoreo que dispara el autoescalado lo hace CloudWatch. En cambio, en un MBaaS como Firebase escalar se reduce a cambiar de plan de precios. Aun así, el autor lo recomienda para empezar y validar rápido, y migrar a IaaS más adelan</w:t>
+      </w:r>
+      <w:r>
+        <w:t>te si hace falta.</w:t>
+      </w:r>
+    </w:p>
+    <w:p>
+      <w:pPr>
+        <w:pStyle w:val="Ttulo2"/>
+        <w:spacing w:before="240" w:after="120"/>
+      </w:pPr>
+      <w:bookmarkStart w:id="6" w:name="_Toc244019683"/>
+      <w:r>
+        <w:t>2.5 Conclusión de la discusión</w:t>
+      </w:r>
+      <w:bookmarkEnd w:id="6"/>
+    </w:p>
+    <w:p>
+      <w:pPr>
+        <w:spacing w:after="120" w:line="276" w:lineRule="auto"/>
+      </w:pPr>
+      <w:r>
+        <w:t xml:space="preserve">Escalar no es un problema del primer día, pero sí una decisión de arquitectura que conviene tomar temprano. Los puntos que más debatimos fueron dos: </w:t>
+      </w:r>
+      <w:r>
+        <w:rPr>
+          <w:b/>
+          <w:bCs/>
+        </w:rPr>
+        <w:t>probar la carga antes de que lo hagan los usuarios</w:t>
+      </w:r>
+      <w:r>
+        <w:t xml:space="preserve"> (el caso del programa de TV) y </w:t>
+      </w:r>
+      <w:r>
+        <w:rPr>
+          <w:b/>
+          <w:bCs/>
+        </w:rPr>
+        <w:t>no confundir escalar con arreglar</w:t>
+      </w:r>
+      <w:r>
+        <w:t>, porque sumar servidores sobre una arquitectura mala solo posterga el problema. Ambos guiaron la estrategia que proponemos para Abrigate en la sección siguiente.</w:t>
+      </w:r>
+    </w:p>
+    <w:p>
+      <w:pPr>
+        <w:pStyle w:val="Ttulo1"/>
+        <w:spacing w:before="360" w:after="160"/>
+      </w:pPr>
+      <w:bookmarkStart w:id="7" w:name="_Toc244019684"/>
+      <w:r>
+        <w:t>3. Entregable 1 — Estrategia de escalabilidad</w:t>
+      </w:r>
+      <w:bookmarkEnd w:id="7"/>
+    </w:p>
+    <w:p>
+      <w:pPr>
+        <w:pStyle w:val="Ttulo2"/>
+        <w:spacing w:before="240" w:after="120"/>
+      </w:pPr>
+      <w:bookmarkStart w:id="8" w:name="_Toc244019685"/>
+      <w:r>
+        <w:t>3.1 Diagnóstico: los desafíos aplicados a Abrigate</w:t>
+      </w:r>
+      <w:bookmarkEnd w:id="8"/>
+    </w:p>
+    <w:p>
+      <w:pPr>
+        <w:spacing w:after="120" w:line="276" w:lineRule="auto"/>
+      </w:pPr>
+      <w:r>
+        <w:t>Antes de diseñar la estrategia, analizamos cómo se manifiestan esos desafíos en nuestra app:</w:t>
       </w:r>
     </w:p>
     <w:tbl>
@@ -2680,21 +3260,10 @@
     </w:p>
     <w:p>
       <w:pPr>
-        <w:pStyle w:val="Ttulo2"/>
-        <w:spacing w:before="240" w:after="120"/>
-      </w:pPr>
-      <w:bookmarkStart w:id="4" w:name="_Toc244019290"/>
-      <w:r>
-        <w:t>2.3 Conclusión del análisis</w:t>
-      </w:r>
-      <w:bookmarkEnd w:id="4"/>
-    </w:p>
-    <w:p>
-      <w:pPr>
         <w:spacing w:after="120" w:line="276" w:lineRule="auto"/>
       </w:pPr>
       <w:r>
-        <w:t xml:space="preserve">El cuello de botella de Abrigate </w:t>
+        <w:t xml:space="preserve">Conclusión: el cuello de botella de Abrigate </w:t>
       </w:r>
       <w:r>
         <w:rPr>
@@ -2704,7 +3273,7 @@
         <w:t>no es la capacidad de cómputo</w:t>
       </w:r>
       <w:r>
-        <w:t xml:space="preserve"> (los servicios de Firebase ya escalan solos, porque los gestiona Google), sino </w:t>
+        <w:t xml:space="preserve">, sino </w:t>
       </w:r>
       <w:r>
         <w:rPr>
@@ -2714,30 +3283,19 @@
         <w:t>la cuota compartida de OpenWeather y la key expuesta en el cliente</w:t>
       </w:r>
       <w:r>
-        <w:t>. Por eso la estrategia se centra en interponer un servicio propio en la nube entre la app y OpenWeather.</w:t>
-      </w:r>
-    </w:p>
-    <w:p>
-      <w:pPr>
-        <w:pStyle w:val="Ttulo1"/>
-        <w:spacing w:before="360" w:after="160"/>
-      </w:pPr>
-      <w:bookmarkStart w:id="5" w:name="_Toc244019291"/>
-      <w:r>
-        <w:t>3. Entregable 1 — Estrategia de escalabilidad</w:t>
-      </w:r>
-      <w:bookmarkEnd w:id="5"/>
+        <w:t>. Los servicios de Firebase (Gemini, App Check, Analytics) son un MBaaS: como plantea el capítulo, su escalado pasa por el plan de precios (Blaze, pago por uso) y no por configurar instancias. Siguiendo la idea de refactorizar antes que sumar capacidad, la estrategia interpone un servicio propio en la nube entre la app y OpenWeather.</w:t>
+      </w:r>
     </w:p>
     <w:p>
       <w:pPr>
         <w:pStyle w:val="Ttulo2"/>
         <w:spacing w:before="240" w:after="120"/>
       </w:pPr>
-      <w:bookmarkStart w:id="6" w:name="_Toc244019292"/>
-      <w:r>
-        <w:t>3.1 Idea central</w:t>
-      </w:r>
-      <w:bookmarkEnd w:id="6"/>
+      <w:bookmarkStart w:id="9" w:name="_Toc244019686"/>
+      <w:r>
+        <w:t>3.2 Idea central</w:t>
+      </w:r>
+      <w:bookmarkEnd w:id="9"/>
     </w:p>
     <w:p>
       <w:pPr>
@@ -2842,11 +3400,11 @@
         <w:pStyle w:val="Ttulo2"/>
         <w:spacing w:before="240" w:after="120"/>
       </w:pPr>
-      <w:bookmarkStart w:id="7" w:name="_Toc244019293"/>
-      <w:r>
-        <w:t>3.2 Autoescalado</w:t>
-      </w:r>
-      <w:bookmarkEnd w:id="7"/>
+      <w:bookmarkStart w:id="10" w:name="_Toc244019687"/>
+      <w:r>
+        <w:t>3.3 Autoescalado</w:t>
+      </w:r>
+      <w:bookmarkEnd w:id="10"/>
     </w:p>
     <w:p>
       <w:pPr>
@@ -3311,11 +3869,11 @@
         <w:pStyle w:val="Ttulo2"/>
         <w:spacing w:before="240" w:after="120"/>
       </w:pPr>
-      <w:bookmarkStart w:id="8" w:name="_Toc244019294"/>
-      <w:r>
-        <w:t>3.3 Balanceo de carga</w:t>
-      </w:r>
-      <w:bookmarkEnd w:id="8"/>
+      <w:bookmarkStart w:id="11" w:name="_Toc244019688"/>
+      <w:r>
+        <w:t>3.4 Balanceo de carga</w:t>
+      </w:r>
+      <w:bookmarkEnd w:id="11"/>
     </w:p>
     <w:p>
       <w:pPr>
@@ -3345,11 +3903,11 @@
         <w:pStyle w:val="Ttulo2"/>
         <w:spacing w:before="240" w:after="120"/>
       </w:pPr>
-      <w:bookmarkStart w:id="9" w:name="_Toc244019295"/>
-      <w:r>
-        <w:t>3.4 Redundancia</w:t>
-      </w:r>
-      <w:bookmarkEnd w:id="9"/>
+      <w:bookmarkStart w:id="12" w:name="_Toc244019689"/>
+      <w:r>
+        <w:t>3.5 Redundancia</w:t>
+      </w:r>
+      <w:bookmarkEnd w:id="12"/>
     </w:p>
     <w:p>
       <w:pPr>
@@ -3436,11 +3994,11 @@
         <w:pStyle w:val="Ttulo2"/>
         <w:spacing w:before="240" w:after="120"/>
       </w:pPr>
-      <w:bookmarkStart w:id="10" w:name="_Toc244019296"/>
-      <w:r>
-        <w:t>3.5 Seguridad como parte de la escalabilidad</w:t>
-      </w:r>
-      <w:bookmarkEnd w:id="10"/>
+      <w:bookmarkStart w:id="13" w:name="_Toc244019690"/>
+      <w:r>
+        <w:t>3.6 Seguridad como parte de la escalabilidad</w:t>
+      </w:r>
+      <w:bookmarkEnd w:id="13"/>
     </w:p>
     <w:p>
       <w:pPr>
@@ -3515,11 +4073,11 @@
         <w:pStyle w:val="Ttulo2"/>
         <w:spacing w:before="240" w:after="120"/>
       </w:pPr>
-      <w:bookmarkStart w:id="11" w:name="_Toc244019297"/>
-      <w:r>
-        <w:t>3.6 Decisiones y compromisos</w:t>
-      </w:r>
-      <w:bookmarkEnd w:id="11"/>
+      <w:bookmarkStart w:id="14" w:name="_Toc244019691"/>
+      <w:r>
+        <w:t>3.7 Decisiones y compromisos</w:t>
+      </w:r>
+      <w:bookmarkEnd w:id="14"/>
     </w:p>
     <w:tbl>
       <w:tblPr>
@@ -3892,7 +4450,7 @@
           </w:tcPr>
           <w:p>
             <w:r>
-              <w:t>Una ciudad grande ocupa decenas de celdas. Ver 3.7.</w:t>
+              <w:t>Una ciudad grande ocupa decenas de celdas. Ver 3.8.</w:t>
             </w:r>
           </w:p>
         </w:tc>
@@ -3908,11 +4466,11 @@
         <w:pStyle w:val="Ttulo2"/>
         <w:spacing w:before="240" w:after="120"/>
       </w:pPr>
-      <w:bookmarkStart w:id="12" w:name="_Toc244019298"/>
-      <w:r>
-        <w:t>3.7 Capacidad estimada</w:t>
-      </w:r>
-      <w:bookmarkEnd w:id="12"/>
+      <w:bookmarkStart w:id="15" w:name="_Toc244019692"/>
+      <w:r>
+        <w:t>3.8 Capacidad estimada</w:t>
+      </w:r>
+      <w:bookmarkEnd w:id="15"/>
     </w:p>
     <w:p>
       <w:pPr>
@@ -3945,22 +4503,22 @@
         <w:pStyle w:val="Ttulo1"/>
         <w:spacing w:before="360" w:after="160"/>
       </w:pPr>
-      <w:bookmarkStart w:id="13" w:name="_Toc244019299"/>
+      <w:bookmarkStart w:id="16" w:name="_Toc244019693"/>
       <w:r>
         <w:t>4. Entregable 2 — Configuración en la nube</w:t>
       </w:r>
-      <w:bookmarkEnd w:id="13"/>
+      <w:bookmarkEnd w:id="16"/>
     </w:p>
     <w:p>
       <w:pPr>
         <w:pStyle w:val="Ttulo2"/>
         <w:spacing w:before="240" w:after="120"/>
       </w:pPr>
-      <w:bookmarkStart w:id="14" w:name="_Toc244019300"/>
+      <w:bookmarkStart w:id="17" w:name="_Toc244019694"/>
       <w:r>
         <w:t>4.1 Recursos creados</w:t>
       </w:r>
-      <w:bookmarkEnd w:id="14"/>
+      <w:bookmarkEnd w:id="17"/>
     </w:p>
     <w:tbl>
       <w:tblPr>
@@ -4325,11 +4883,11 @@
         <w:pStyle w:val="Ttulo2"/>
         <w:spacing w:before="240" w:after="120"/>
       </w:pPr>
-      <w:bookmarkStart w:id="15" w:name="_Toc244019301"/>
+      <w:bookmarkStart w:id="18" w:name="_Toc244019695"/>
       <w:r>
         <w:t>4.2 Comandos de despliegue</w:t>
       </w:r>
-      <w:bookmarkEnd w:id="15"/>
+      <w:bookmarkEnd w:id="18"/>
     </w:p>
     <w:p>
       <w:pPr>
@@ -4542,11 +5100,11 @@
         <w:pStyle w:val="Ttulo2"/>
         <w:spacing w:before="240" w:after="120"/>
       </w:pPr>
-      <w:bookmarkStart w:id="16" w:name="_Toc244019302"/>
+      <w:bookmarkStart w:id="19" w:name="_Toc244019696"/>
       <w:r>
         <w:t>4.3 Funcionamiento del servicio</w:t>
       </w:r>
-      <w:bookmarkEnd w:id="16"/>
+      <w:bookmarkEnd w:id="19"/>
     </w:p>
     <w:p>
       <w:pPr>
@@ -4633,11 +5191,11 @@
         <w:pStyle w:val="Ttulo2"/>
         <w:spacing w:before="240" w:after="120"/>
       </w:pPr>
-      <w:bookmarkStart w:id="17" w:name="_Toc244019303"/>
+      <w:bookmarkStart w:id="20" w:name="_Toc244019697"/>
       <w:r>
         <w:t>4.4 Pruebas y evidencia</w:t>
       </w:r>
-      <w:bookmarkEnd w:id="17"/>
+      <w:bookmarkEnd w:id="20"/>
     </w:p>
     <w:p>
       <w:pPr>
@@ -6189,11 +6747,11 @@
         <w:pageBreakBefore/>
         <w:spacing w:after="160"/>
       </w:pPr>
-      <w:bookmarkStart w:id="18" w:name="_Toc244019304"/>
+      <w:bookmarkStart w:id="21" w:name="_Toc244019698"/>
       <w:r>
         <w:t>5. Entregable 3 — Diagrama de arquitectura actualizado</w:t>
       </w:r>
-      <w:bookmarkEnd w:id="18"/>
+      <w:bookmarkEnd w:id="21"/>
     </w:p>
     <w:p>
       <w:pPr>
@@ -6205,7 +6763,7 @@
           <w:noProof/>
         </w:rPr>
         <w:drawing>
-          <wp:inline distT="0" distB="0" distL="0" distR="0" wp14:anchorId="37EE1B03" wp14:editId="448F1EA0">
+          <wp:inline distT="0" distB="0" distL="0" distR="0" wp14:anchorId="4B62E39B" wp14:editId="2BC2A107">
             <wp:extent cx="5715000" cy="4286250"/>
             <wp:effectExtent l="0" t="0" r="0" b="0"/>
             <wp:docPr id="1" name="Imagen 1"/>
@@ -6265,11 +6823,11 @@
         <w:pStyle w:val="Ttulo2"/>
         <w:spacing w:before="240" w:after="120"/>
       </w:pPr>
-      <w:bookmarkStart w:id="19" w:name="_Toc244019305"/>
+      <w:bookmarkStart w:id="22" w:name="_Toc244019699"/>
       <w:r>
         <w:t>5.1 Cambios respecto de la arquitectura anterior</w:t>
       </w:r>
-      <w:bookmarkEnd w:id="19"/>
+      <w:bookmarkEnd w:id="22"/>
     </w:p>
     <w:p>
       <w:pPr>
@@ -6328,7 +6886,7 @@
         <w:t xml:space="preserve">Sin cambios: </w:t>
       </w:r>
       <w:r>
-        <w:t>Firebase (AI Logic con Gemini, App Check y Analytics) sigue conectado directo desde la app, porque Google ya lo escala de forma automática.</w:t>
+        <w:t>Firebase (AI Logic con Gemini, App Check y Analytics) sigue conectado directo desde la app: es un MBaaS gestionado por Google y su escalado pasa por el plan de facturación (Blaze).</w:t>
       </w:r>
     </w:p>
     <w:p>
@@ -6336,11 +6894,11 @@
         <w:pStyle w:val="Ttulo2"/>
         <w:spacing w:before="240" w:after="120"/>
       </w:pPr>
-      <w:bookmarkStart w:id="20" w:name="_Toc244019306"/>
+      <w:bookmarkStart w:id="23" w:name="_Toc244019700"/>
       <w:r>
         <w:t>5.2 Mecanismos de autoescalado representados</w:t>
       </w:r>
-      <w:bookmarkEnd w:id="20"/>
+      <w:bookmarkEnd w:id="23"/>
     </w:p>
     <w:p>
       <w:pPr>
@@ -6412,11 +6970,11 @@
         <w:pStyle w:val="Ttulo1"/>
         <w:spacing w:before="360" w:after="160"/>
       </w:pPr>
-      <w:bookmarkStart w:id="21" w:name="_Toc244019307"/>
+      <w:bookmarkStart w:id="24" w:name="_Toc244019701"/>
       <w:r>
         <w:t>6. Conclusiones</w:t>
       </w:r>
-      <w:bookmarkEnd w:id="21"/>
+      <w:bookmarkEnd w:id="24"/>
     </w:p>
     <w:p>
       <w:pPr>
@@ -6439,11 +6997,11 @@
         <w:pStyle w:val="Ttulo2"/>
         <w:spacing w:before="240" w:after="120"/>
       </w:pPr>
-      <w:bookmarkStart w:id="22" w:name="_Toc244019308"/>
+      <w:bookmarkStart w:id="25" w:name="_Toc244019702"/>
       <w:r>
         <w:t>Próximos pasos</w:t>
       </w:r>
-      <w:bookmarkEnd w:id="22"/>
+      <w:bookmarkEnd w:id="25"/>
     </w:p>
     <w:p>
       <w:pPr>
@@ -6595,210 +7153,210 @@
 <file path=word/numbering.xml><?xml version="1.0" encoding="utf-8"?>
 <w:numbering xmlns:wpc="http://schemas.microsoft.com/office/word/2010/wordprocessingCanvas" xmlns:cx="http://schemas.microsoft.com/office/drawing/2014/chartex" xmlns:cx1="http://schemas.microsoft.com/office/drawing/2015/9/8/chartex" xmlns:cx2="http://schemas.microsoft.com/office/drawing/2015/10/21/chartex" xmlns:cx3="http://schemas.microsoft.com/office/drawing/2016/5/9/chartex" xmlns:cx4="http://schemas.microsoft.com/office/drawing/2016/5/10/chartex" xmlns:cx5="http://schemas.microsoft.com/office/drawing/2016/5/11/chartex" xmlns:cx6="http://schemas.microsoft.com/office/drawing/2016/5/12/chartex" xmlns:cx7="http://schemas.microsoft.com/office/drawing/2016/5/13/chartex" xmlns:cx8="http://schemas.microsoft.com/office/drawing/2016/5/14/chartex" xmlns:mc="http://schemas.openxmlformats.org/markup-compatibility/2006" xmlns:aink="http://schemas.microsoft.com/office/drawing/2016/ink" xmlns:am3d="http://schemas.microsoft.com/office/drawing/2017/model3d" xmlns:o="urn:schemas-microsoft-com:office:office" xmlns:oel="http://schemas.microsoft.com/office/2019/extlst" xmlns:r="http://schemas.openxmlformats.org/officeDocument/2006/relationships" xmlns:m="http://schemas.openxmlformats.org/officeDocument/2006/math" xmlns:v="urn:schemas-microsoft-com:vml" xmlns:wp14="http://schemas.microsoft.com/office/word/2010/wordprocessingDrawing" xmlns:wp="http://schemas.openxmlformats.org/drawingml/2006/wordprocessingDrawing" xmlns:w10="urn:schemas-microsoft-com:office:word" xmlns:w="http://schemas.openxmlformats.org/wordprocessingml/2006/main" xmlns:w14="http://schemas.microsoft.com/office/word/2010/wordml" xmlns:w15="http://schemas.microsoft.com/office/word/2012/wordml" xmlns:w16cex="http://schemas.microsoft.com/office/word/2018/wordml/cex" xmlns:w16cid="http://schemas.microsoft.com/office/word/2016/wordml/cid" xmlns:w16="http://schemas.microsoft.com/office/word/2018/wordml" xmlns:w16du="http://schemas.microsoft.com/office/word/2023/wordml/word16du" xmlns:w16sdtdh="http://schemas.microsoft.com/office/word/2020/wordml/sdtdatahash" xmlns:w16sdtfl="http://schemas.microsoft.com/office/word/2024/wordml/sdtformatlock" xmlns:w16se="http://schemas.microsoft.com/office/word/2015/wordml/symex" xmlns:wpg="http://schemas.microsoft.com/office/word/2010/wordprocessingGroup" xmlns:wpi="http://schemas.microsoft.com/office/word/2010/wordprocessingInk" xmlns:wne="http://schemas.microsoft.com/office/word/2006/wordml" xmlns:wps="http://schemas.microsoft.com/office/word/2010/wordprocessingShape" mc:Ignorable="w14 w15 w16se w16cid w16 w16cex w16sdtdh w16sdtfl w16du wp14">
   <w:abstractNum w:abstractNumId="0" w15:restartNumberingAfterBreak="0">
-    <w:nsid w:val="06F10535"/>
+    <w:nsid w:val="074769A4"/>
     <w:multiLevelType w:val="hybridMultilevel"/>
-    <w:tmpl w:val="DACC8766"/>
-    <w:lvl w:ilvl="0" w:tplc="B71C462C">
+    <w:tmpl w:val="269EED38"/>
+    <w:lvl w:ilvl="0" w:tplc="20826684" w:tentative="1">
       <w:start w:val="1"/>
-      <w:numFmt w:val="decimal"/>
-      <w:lvlText w:val="%1."/>
+      <w:numFmt w:val="bullet"/>
+      <w:lvlText w:val="●"/>
       <w:lvlJc w:val="left"/>
       <w:pPr>
-        <w:ind w:left="540" w:hanging="300"/>
+        <w:ind w:left="720" w:hanging="360"/>
       </w:pPr>
     </w:lvl>
-    <w:lvl w:ilvl="1" w:tplc="89A4E47A">
+    <w:lvl w:ilvl="1" w:tplc="5824F336" w:tentative="1">
+      <w:start w:val="1"/>
+      <w:numFmt w:val="bullet"/>
+      <w:lvlText w:val="○"/>
+      <w:lvlJc w:val="left"/>
+      <w:pPr>
+        <w:ind w:left="1440" w:hanging="360"/>
+      </w:pPr>
+    </w:lvl>
+    <w:lvl w:ilvl="2" w:tplc="23584120" w:tentative="1">
+      <w:start w:val="1"/>
+      <w:numFmt w:val="bullet"/>
+      <w:lvlText w:val="■"/>
+      <w:lvlJc w:val="left"/>
+      <w:pPr>
+        <w:ind w:left="2160" w:hanging="360"/>
+      </w:pPr>
+    </w:lvl>
+    <w:lvl w:ilvl="3" w:tplc="D11CC930" w:tentative="1">
+      <w:start w:val="1"/>
+      <w:numFmt w:val="bullet"/>
+      <w:lvlText w:val="●"/>
+      <w:lvlJc w:val="left"/>
+      <w:pPr>
+        <w:ind w:left="2880" w:hanging="360"/>
+      </w:pPr>
+    </w:lvl>
+    <w:lvl w:ilvl="4" w:tplc="C78E2680" w:tentative="1">
+      <w:start w:val="1"/>
+      <w:numFmt w:val="bullet"/>
+      <w:lvlText w:val="○"/>
+      <w:lvlJc w:val="left"/>
+      <w:pPr>
+        <w:ind w:left="3600" w:hanging="360"/>
+      </w:pPr>
+    </w:lvl>
+    <w:lvl w:ilvl="5" w:tplc="5B6A6FF2" w:tentative="1">
+      <w:start w:val="1"/>
+      <w:numFmt w:val="bullet"/>
+      <w:lvlText w:val="■"/>
+      <w:lvlJc w:val="left"/>
+      <w:pPr>
+        <w:ind w:left="4320" w:hanging="360"/>
+      </w:pPr>
+    </w:lvl>
+    <w:lvl w:ilvl="6" w:tplc="1A940600" w:tentative="1">
+      <w:start w:val="1"/>
+      <w:numFmt w:val="bullet"/>
+      <w:lvlText w:val="●"/>
+      <w:lvlJc w:val="left"/>
+      <w:pPr>
+        <w:ind w:left="5040" w:hanging="360"/>
+      </w:pPr>
+    </w:lvl>
+    <w:lvl w:ilvl="7" w:tplc="75409116" w:tentative="1">
+      <w:start w:val="1"/>
+      <w:numFmt w:val="bullet"/>
+      <w:lvlText w:val="●"/>
+      <w:lvlJc w:val="left"/>
+      <w:pPr>
+        <w:ind w:left="5760" w:hanging="360"/>
+      </w:pPr>
+    </w:lvl>
+    <w:lvl w:ilvl="8" w:tplc="63042CCA" w:tentative="1">
+      <w:start w:val="1"/>
+      <w:numFmt w:val="bullet"/>
+      <w:lvlText w:val="●"/>
+      <w:lvlJc w:val="left"/>
+      <w:pPr>
+        <w:ind w:left="6480" w:hanging="360"/>
+      </w:pPr>
+    </w:lvl>
+  </w:abstractNum>
+  <w:abstractNum w:abstractNumId="1" w15:restartNumberingAfterBreak="0">
+    <w:nsid w:val="351703B0"/>
+    <w:multiLevelType w:val="hybridMultilevel"/>
+    <w:tmpl w:val="6928AE70"/>
+    <w:lvl w:ilvl="0" w:tplc="6F989BF2">
+      <w:start w:val="1"/>
+      <w:numFmt w:val="bullet"/>
+      <w:lvlText w:val="•"/>
+      <w:lvlJc w:val="left"/>
+      <w:pPr>
+        <w:ind w:left="540" w:hanging="270"/>
+      </w:pPr>
+    </w:lvl>
+    <w:lvl w:ilvl="1" w:tplc="09D4719C" w:tentative="1">
+      <w:start w:val="1"/>
+      <w:numFmt w:val="bullet"/>
+      <w:lvlText w:val="◦"/>
+      <w:lvlJc w:val="left"/>
+      <w:pPr>
+        <w:ind w:left="1080" w:hanging="270"/>
+      </w:pPr>
+    </w:lvl>
+    <w:lvl w:ilvl="2" w:tplc="E8386A0E">
       <w:numFmt w:val="decimal"/>
       <w:lvlText w:val=""/>
       <w:lvlJc w:val="left"/>
     </w:lvl>
-    <w:lvl w:ilvl="2" w:tplc="C3BEFDA4">
+    <w:lvl w:ilvl="3" w:tplc="26E6A0C0">
       <w:numFmt w:val="decimal"/>
       <w:lvlText w:val=""/>
       <w:lvlJc w:val="left"/>
     </w:lvl>
-    <w:lvl w:ilvl="3" w:tplc="418E70CA">
+    <w:lvl w:ilvl="4" w:tplc="860049B0">
       <w:numFmt w:val="decimal"/>
       <w:lvlText w:val=""/>
       <w:lvlJc w:val="left"/>
     </w:lvl>
-    <w:lvl w:ilvl="4" w:tplc="8F260ECC">
+    <w:lvl w:ilvl="5" w:tplc="3FCE21A6">
       <w:numFmt w:val="decimal"/>
       <w:lvlText w:val=""/>
       <w:lvlJc w:val="left"/>
     </w:lvl>
-    <w:lvl w:ilvl="5" w:tplc="2EA03266">
+    <w:lvl w:ilvl="6" w:tplc="1E309310">
       <w:numFmt w:val="decimal"/>
       <w:lvlText w:val=""/>
       <w:lvlJc w:val="left"/>
     </w:lvl>
-    <w:lvl w:ilvl="6" w:tplc="FDE25D4A">
+    <w:lvl w:ilvl="7" w:tplc="49E66CDA">
       <w:numFmt w:val="decimal"/>
       <w:lvlText w:val=""/>
       <w:lvlJc w:val="left"/>
     </w:lvl>
-    <w:lvl w:ilvl="7" w:tplc="4864B776">
-      <w:numFmt w:val="decimal"/>
-      <w:lvlText w:val=""/>
-      <w:lvlJc w:val="left"/>
-    </w:lvl>
-    <w:lvl w:ilvl="8" w:tplc="DE68E448">
-      <w:numFmt w:val="decimal"/>
-      <w:lvlText w:val=""/>
-      <w:lvlJc w:val="left"/>
-    </w:lvl>
-  </w:abstractNum>
-  <w:abstractNum w:abstractNumId="1" w15:restartNumberingAfterBreak="0">
-    <w:nsid w:val="525D6E2E"/>
-    <w:multiLevelType w:val="hybridMultilevel"/>
-    <w:tmpl w:val="34ECA442"/>
-    <w:lvl w:ilvl="0" w:tplc="F22E7D5E">
-      <w:start w:val="1"/>
-      <w:numFmt w:val="bullet"/>
-      <w:lvlText w:val="•"/>
-      <w:lvlJc w:val="left"/>
-      <w:pPr>
-        <w:ind w:left="540" w:hanging="270"/>
-      </w:pPr>
-    </w:lvl>
-    <w:lvl w:ilvl="1" w:tplc="DD8003D4" w:tentative="1">
-      <w:start w:val="1"/>
-      <w:numFmt w:val="bullet"/>
-      <w:lvlText w:val="◦"/>
-      <w:lvlJc w:val="left"/>
-      <w:pPr>
-        <w:ind w:left="1080" w:hanging="270"/>
-      </w:pPr>
-    </w:lvl>
-    <w:lvl w:ilvl="2" w:tplc="196CC80E">
-      <w:numFmt w:val="decimal"/>
-      <w:lvlText w:val=""/>
-      <w:lvlJc w:val="left"/>
-    </w:lvl>
-    <w:lvl w:ilvl="3" w:tplc="6EC61FD8">
-      <w:numFmt w:val="decimal"/>
-      <w:lvlText w:val=""/>
-      <w:lvlJc w:val="left"/>
-    </w:lvl>
-    <w:lvl w:ilvl="4" w:tplc="0D781500">
-      <w:numFmt w:val="decimal"/>
-      <w:lvlText w:val=""/>
-      <w:lvlJc w:val="left"/>
-    </w:lvl>
-    <w:lvl w:ilvl="5" w:tplc="E22E9C4C">
-      <w:numFmt w:val="decimal"/>
-      <w:lvlText w:val=""/>
-      <w:lvlJc w:val="left"/>
-    </w:lvl>
-    <w:lvl w:ilvl="6" w:tplc="7B4C8BBC">
-      <w:numFmt w:val="decimal"/>
-      <w:lvlText w:val=""/>
-      <w:lvlJc w:val="left"/>
-    </w:lvl>
-    <w:lvl w:ilvl="7" w:tplc="2E5CEAA8">
-      <w:numFmt w:val="decimal"/>
-      <w:lvlText w:val=""/>
-      <w:lvlJc w:val="left"/>
-    </w:lvl>
-    <w:lvl w:ilvl="8" w:tplc="F5F0B37A">
+    <w:lvl w:ilvl="8" w:tplc="897AAC24">
       <w:numFmt w:val="decimal"/>
       <w:lvlText w:val=""/>
       <w:lvlJc w:val="left"/>
     </w:lvl>
   </w:abstractNum>
   <w:abstractNum w:abstractNumId="2" w15:restartNumberingAfterBreak="0">
-    <w:nsid w:val="623C588B"/>
+    <w:nsid w:val="41D66606"/>
     <w:multiLevelType w:val="hybridMultilevel"/>
-    <w:tmpl w:val="391E999E"/>
-    <w:lvl w:ilvl="0" w:tplc="EE3E6B70" w:tentative="1">
+    <w:tmpl w:val="5D446DB4"/>
+    <w:lvl w:ilvl="0" w:tplc="EA8CC58C">
       <w:start w:val="1"/>
-      <w:numFmt w:val="bullet"/>
-      <w:lvlText w:val="●"/>
+      <w:numFmt w:val="decimal"/>
+      <w:lvlText w:val="%1."/>
       <w:lvlJc w:val="left"/>
       <w:pPr>
-        <w:ind w:left="720" w:hanging="360"/>
+        <w:ind w:left="540" w:hanging="300"/>
       </w:pPr>
     </w:lvl>
-    <w:lvl w:ilvl="1" w:tplc="0E7AC908" w:tentative="1">
-      <w:start w:val="1"/>
-      <w:numFmt w:val="bullet"/>
-      <w:lvlText w:val="○"/>
+    <w:lvl w:ilvl="1" w:tplc="0AF84E8E">
+      <w:numFmt w:val="decimal"/>
+      <w:lvlText w:val=""/>
       <w:lvlJc w:val="left"/>
-      <w:pPr>
-        <w:ind w:left="1440" w:hanging="360"/>
-      </w:pPr>
     </w:lvl>
-    <w:lvl w:ilvl="2" w:tplc="F64AFD0A" w:tentative="1">
-      <w:start w:val="1"/>
-      <w:numFmt w:val="bullet"/>
-      <w:lvlText w:val="■"/>
+    <w:lvl w:ilvl="2" w:tplc="F7A6485C">
+      <w:numFmt w:val="decimal"/>
+      <w:lvlText w:val=""/>
       <w:lvlJc w:val="left"/>
-      <w:pPr>
-        <w:ind w:left="2160" w:hanging="360"/>
-      </w:pPr>
     </w:lvl>
-    <w:lvl w:ilvl="3" w:tplc="EBCCB720" w:tentative="1">
-      <w:start w:val="1"/>
-      <w:numFmt w:val="bullet"/>
-      <w:lvlText w:val="●"/>
+    <w:lvl w:ilvl="3" w:tplc="6EE60D54">
+      <w:numFmt w:val="decimal"/>
+      <w:lvlText w:val=""/>
       <w:lvlJc w:val="left"/>
-      <w:pPr>
-        <w:ind w:left="2880" w:hanging="360"/>
-      </w:pPr>
     </w:lvl>
-    <w:lvl w:ilvl="4" w:tplc="D58C0948" w:tentative="1">
-      <w:start w:val="1"/>
-      <w:numFmt w:val="bullet"/>
-      <w:lvlText w:val="○"/>
+    <w:lvl w:ilvl="4" w:tplc="D59667FE">
+      <w:numFmt w:val="decimal"/>
+      <w:lvlText w:val=""/>
       <w:lvlJc w:val="left"/>
-      <w:pPr>
-        <w:ind w:left="3600" w:hanging="360"/>
-      </w:pPr>
     </w:lvl>
-    <w:lvl w:ilvl="5" w:tplc="4C001BC4" w:tentative="1">
-      <w:start w:val="1"/>
-      <w:numFmt w:val="bullet"/>
-      <w:lvlText w:val="■"/>
+    <w:lvl w:ilvl="5" w:tplc="E1CAB47E">
+      <w:numFmt w:val="decimal"/>
+      <w:lvlText w:val=""/>
       <w:lvlJc w:val="left"/>
-      <w:pPr>
-        <w:ind w:left="4320" w:hanging="360"/>
-      </w:pPr>
     </w:lvl>
-    <w:lvl w:ilvl="6" w:tplc="AB04271E" w:tentative="1">
-      <w:start w:val="1"/>
-      <w:numFmt w:val="bullet"/>
-      <w:lvlText w:val="●"/>
+    <w:lvl w:ilvl="6" w:tplc="BB900C6C">
+      <w:numFmt w:val="decimal"/>
+      <w:lvlText w:val=""/>
       <w:lvlJc w:val="left"/>
-      <w:pPr>
-        <w:ind w:left="5040" w:hanging="360"/>
-      </w:pPr>
     </w:lvl>
-    <w:lvl w:ilvl="7" w:tplc="0E8EA5AC" w:tentative="1">
-      <w:start w:val="1"/>
-      <w:numFmt w:val="bullet"/>
-      <w:lvlText w:val="●"/>
+    <w:lvl w:ilvl="7" w:tplc="08D06AA0">
+      <w:numFmt w:val="decimal"/>
+      <w:lvlText w:val=""/>
       <w:lvlJc w:val="left"/>
-      <w:pPr>
-        <w:ind w:left="5760" w:hanging="360"/>
-      </w:pPr>
     </w:lvl>
-    <w:lvl w:ilvl="8" w:tplc="3A785830" w:tentative="1">
-      <w:start w:val="1"/>
-      <w:numFmt w:val="bullet"/>
-      <w:lvlText w:val="●"/>
+    <w:lvl w:ilvl="8" w:tplc="FE2EEB46">
+      <w:numFmt w:val="decimal"/>
+      <w:lvlText w:val=""/>
       <w:lvlJc w:val="left"/>
-      <w:pPr>
-        <w:ind w:left="6480" w:hanging="360"/>
-      </w:pPr>
     </w:lvl>
   </w:abstractNum>
-  <w:num w:numId="1" w16cid:durableId="768550224">
-    <w:abstractNumId w:val="2"/>
+  <w:num w:numId="1" w16cid:durableId="80025988">
+    <w:abstractNumId w:val="0"/>
     <w:lvlOverride w:ilvl="0">
       <w:startOverride w:val="1"/>
     </w:lvlOverride>
   </w:num>
-  <w:num w:numId="2" w16cid:durableId="1017200342">
+  <w:num w:numId="2" w16cid:durableId="1937860693">
     <w:abstractNumId w:val="1"/>
     <w:lvlOverride w:ilvl="0">
       <w:startOverride w:val="1"/>
@@ -6807,8 +7365,8 @@
       <w:startOverride w:val="1"/>
     </w:lvlOverride>
   </w:num>
-  <w:num w:numId="3" w16cid:durableId="742679030">
-    <w:abstractNumId w:val="0"/>
+  <w:num w:numId="3" w16cid:durableId="1270814174">
+    <w:abstractNumId w:val="2"/>
     <w:lvlOverride w:ilvl="0">
       <w:startOverride w:val="1"/>
     </w:lvlOverride>

</xml_diff>